<commit_message>
Arreglamos un error de categorias que llevaba a la seccion de nosotros que no existe
</commit_message>
<xml_diff>
--- a/LEVANTAMIENTO DE DATOS.docx
+++ b/LEVANTAMIENTO DE DATOS.docx
@@ -694,7 +694,7 @@
           <w14:ligatures w14:val="none"/>
         </w:rPr>
         <w:pict w14:anchorId="0C5C1F6D">
-          <v:rect id="_x0000_i1029" style="width:0;height:1.5pt" o:hralign="center" o:hrstd="t" o:hr="t" fillcolor="#a0a0a0" stroked="f"/>
+          <v:rect id="_x0000_i1025" style="width:0;height:1.5pt" o:hralign="center" o:hrstd="t" o:hr="t" fillcolor="#a0a0a0" stroked="f"/>
         </w:pict>
       </w:r>
     </w:p>
@@ -1262,7 +1262,7 @@
           <w14:ligatures w14:val="none"/>
         </w:rPr>
         <w:pict w14:anchorId="2BD12E3A">
-          <v:rect id="_x0000_i1032" style="width:0;height:1.5pt" o:hralign="center" o:hrstd="t" o:hr="t" fillcolor="#a0a0a0" stroked="f"/>
+          <v:rect id="_x0000_i1026" style="width:0;height:1.5pt" o:hralign="center" o:hrstd="t" o:hr="t" fillcolor="#a0a0a0" stroked="f"/>
         </w:pict>
       </w:r>
     </w:p>
@@ -1574,7 +1574,7 @@
         </w:rPr>
         <w:lastRenderedPageBreak/>
         <w:pict w14:anchorId="12E74230">
-          <v:rect id="_x0000_i1033" style="width:0;height:1.5pt" o:hralign="center" o:hrstd="t" o:hr="t" fillcolor="#a0a0a0" stroked="f"/>
+          <v:rect id="_x0000_i1027" style="width:0;height:1.5pt" o:hralign="center" o:hrstd="t" o:hr="t" fillcolor="#a0a0a0" stroked="f"/>
         </w:pict>
       </w:r>
     </w:p>
@@ -2181,7 +2181,7 @@
           <w14:ligatures w14:val="none"/>
         </w:rPr>
         <w:pict w14:anchorId="4CE2DA1E">
-          <v:rect id="_x0000_i1034" style="width:0;height:1.5pt" o:hralign="center" o:hrstd="t" o:hr="t" fillcolor="#a0a0a0" stroked="f"/>
+          <v:rect id="_x0000_i1028" style="width:0;height:1.5pt" o:hralign="center" o:hrstd="t" o:hr="t" fillcolor="#a0a0a0" stroked="f"/>
         </w:pict>
       </w:r>
     </w:p>
@@ -2308,7 +2308,7 @@
           <w14:ligatures w14:val="none"/>
         </w:rPr>
         <w:pict w14:anchorId="35D690F5">
-          <v:rect id="_x0000_i1035" style="width:0;height:1.5pt" o:hralign="center" o:hrstd="t" o:hr="t" fillcolor="#a0a0a0" stroked="f"/>
+          <v:rect id="_x0000_i1029" style="width:0;height:1.5pt" o:hralign="center" o:hrstd="t" o:hr="t" fillcolor="#a0a0a0" stroked="f"/>
         </w:pict>
       </w:r>
     </w:p>
@@ -2446,7 +2446,7 @@
           <w14:ligatures w14:val="none"/>
         </w:rPr>
         <w:pict w14:anchorId="0383DB9A">
-          <v:rect id="_x0000_i1036" style="width:0;height:1.5pt" o:hralign="center" o:hrstd="t" o:hr="t" fillcolor="#a0a0a0" stroked="f"/>
+          <v:rect id="_x0000_i1030" style="width:0;height:1.5pt" o:hralign="center" o:hrstd="t" o:hr="t" fillcolor="#a0a0a0" stroked="f"/>
         </w:pict>
       </w:r>
     </w:p>
@@ -2813,7 +2813,7 @@
           <w14:ligatures w14:val="none"/>
         </w:rPr>
         <w:pict w14:anchorId="47469A1F">
-          <v:rect id="_x0000_i1038" style="width:0;height:1.5pt" o:hralign="center" o:hrstd="t" o:hr="t" fillcolor="#a0a0a0" stroked="f"/>
+          <v:rect id="_x0000_i1031" style="width:0;height:1.5pt" o:hralign="center" o:hrstd="t" o:hr="t" fillcolor="#a0a0a0" stroked="f"/>
         </w:pict>
       </w:r>
     </w:p>
@@ -2892,7 +2892,7 @@
           <w14:ligatures w14:val="none"/>
         </w:rPr>
         <w:pict w14:anchorId="7A9371B2">
-          <v:rect id="_x0000_i1039" style="width:0;height:1.5pt" o:hralign="center" o:hrstd="t" o:hr="t" fillcolor="#a0a0a0" stroked="f"/>
+          <v:rect id="_x0000_i1032" style="width:0;height:1.5pt" o:hralign="center" o:hrstd="t" o:hr="t" fillcolor="#a0a0a0" stroked="f"/>
         </w:pict>
       </w:r>
     </w:p>
@@ -3253,7 +3253,7 @@
           <w14:ligatures w14:val="none"/>
         </w:rPr>
         <w:pict w14:anchorId="057DC316">
-          <v:rect id="_x0000_i1040" style="width:0;height:1.5pt" o:hralign="center" o:hrstd="t" o:hr="t" fillcolor="#a0a0a0" stroked="f"/>
+          <v:rect id="_x0000_i1033" style="width:0;height:1.5pt" o:hralign="center" o:hrstd="t" o:hr="t" fillcolor="#a0a0a0" stroked="f"/>
         </w:pict>
       </w:r>
     </w:p>
@@ -3495,7 +3495,7 @@
           <w14:ligatures w14:val="none"/>
         </w:rPr>
         <w:pict w14:anchorId="44B1DB90">
-          <v:rect id="_x0000_i1041" style="width:0;height:1.5pt" o:hralign="center" o:hrstd="t" o:hr="t" fillcolor="#a0a0a0" stroked="f"/>
+          <v:rect id="_x0000_i1034" style="width:0;height:1.5pt" o:hralign="center" o:hrstd="t" o:hr="t" fillcolor="#a0a0a0" stroked="f"/>
         </w:pict>
       </w:r>
     </w:p>
@@ -3895,7 +3895,7 @@
           <w14:ligatures w14:val="none"/>
         </w:rPr>
         <w:pict w14:anchorId="76410278">
-          <v:rect id="_x0000_i1042" style="width:0;height:1.5pt" o:hralign="center" o:hrstd="t" o:hr="t" fillcolor="#a0a0a0" stroked="f"/>
+          <v:rect id="_x0000_i1035" style="width:0;height:1.5pt" o:hralign="center" o:hrstd="t" o:hr="t" fillcolor="#a0a0a0" stroked="f"/>
         </w:pict>
       </w:r>
     </w:p>
@@ -5001,7 +5001,7 @@
           <w14:ligatures w14:val="none"/>
         </w:rPr>
         <w:pict w14:anchorId="3708A9A9">
-          <v:rect id="_x0000_i1043" style="width:0;height:1.5pt" o:hralign="center" o:hrstd="t" o:hr="t" fillcolor="#a0a0a0" stroked="f"/>
+          <v:rect id="_x0000_i1036" style="width:0;height:1.5pt" o:hralign="center" o:hrstd="t" o:hr="t" fillcolor="#a0a0a0" stroked="f"/>
         </w:pict>
       </w:r>
     </w:p>
@@ -5234,7 +5234,7 @@
         </w:rPr>
         <w:lastRenderedPageBreak/>
         <w:pict w14:anchorId="626179CE">
-          <v:rect id="_x0000_i1044" style="width:0;height:1.5pt" o:hralign="center" o:hrstd="t" o:hr="t" fillcolor="#a0a0a0" stroked="f"/>
+          <v:rect id="_x0000_i1037" style="width:0;height:1.5pt" o:hralign="center" o:hrstd="t" o:hr="t" fillcolor="#a0a0a0" stroked="f"/>
         </w:pict>
       </w:r>
     </w:p>
@@ -5757,7 +5757,7 @@
           <w14:ligatures w14:val="none"/>
         </w:rPr>
         <w:pict w14:anchorId="508AC3A1">
-          <v:rect id="_x0000_i1045" style="width:0;height:1.5pt" o:hralign="center" o:hrstd="t" o:hr="t" fillcolor="#a0a0a0" stroked="f"/>
+          <v:rect id="_x0000_i1038" style="width:0;height:1.5pt" o:hralign="center" o:hrstd="t" o:hr="t" fillcolor="#a0a0a0" stroked="f"/>
         </w:pict>
       </w:r>
     </w:p>
@@ -6032,7 +6032,7 @@
           <w14:ligatures w14:val="none"/>
         </w:rPr>
         <w:pict w14:anchorId="767FD1A0">
-          <v:rect id="_x0000_i1046" style="width:0;height:1.5pt" o:hralign="center" o:hrstd="t" o:hr="t" fillcolor="#a0a0a0" stroked="f"/>
+          <v:rect id="_x0000_i1039" style="width:0;height:1.5pt" o:hralign="center" o:hrstd="t" o:hr="t" fillcolor="#a0a0a0" stroked="f"/>
         </w:pict>
       </w:r>
     </w:p>
@@ -6212,7 +6212,31 @@
           <w:lang w:eastAsia="es-MX"/>
           <w14:ligatures w14:val="none"/>
         </w:rPr>
-        <w:t xml:space="preserve"> mayormente están mas activos en </w:t>
+        <w:t xml:space="preserve"> mayormente están </w:t>
+      </w:r>
+      <w:proofErr w:type="spellStart"/>
+      <w:r>
+        <w:rPr>
+          <w:rFonts w:ascii="Times New Roman" w:eastAsia="Times New Roman" w:hAnsi="Times New Roman" w:cs="Times New Roman"/>
+          <w:kern w:val="0"/>
+          <w:sz w:val="24"/>
+          <w:szCs w:val="24"/>
+          <w:lang w:eastAsia="es-MX"/>
+          <w14:ligatures w14:val="none"/>
+        </w:rPr>
+        <w:t>mas</w:t>
+      </w:r>
+      <w:proofErr w:type="spellEnd"/>
+      <w:r>
+        <w:rPr>
+          <w:rFonts w:ascii="Times New Roman" w:eastAsia="Times New Roman" w:hAnsi="Times New Roman" w:cs="Times New Roman"/>
+          <w:kern w:val="0"/>
+          <w:sz w:val="24"/>
+          <w:szCs w:val="24"/>
+          <w:lang w:eastAsia="es-MX"/>
+          <w14:ligatures w14:val="none"/>
+        </w:rPr>
+        <w:t xml:space="preserve"> activos en </w:t>
       </w:r>
       <w:proofErr w:type="spellStart"/>
       <w:r>
@@ -6431,6 +6455,9 @@
         </w:drawing>
       </w:r>
       <w:r>
+        <w:rPr>
+          <w:noProof/>
+        </w:rPr>
         <w:drawing>
           <wp:inline distT="0" distB="0" distL="0" distR="0" wp14:anchorId="4932FE7B" wp14:editId="73950D52">
             <wp:extent cx="5612130" cy="2687955"/>
@@ -6832,7 +6859,7 @@
       <w:pPr>
         <w:spacing w:before="100" w:beforeAutospacing="1" w:after="100" w:afterAutospacing="1" w:line="240" w:lineRule="auto"/>
         <w:rPr>
-          <w:rFonts w:ascii="Times New Roman" w:eastAsia="Times New Roman" w:hAnsi="Times New Roman" w:cs="Times New Roman"/>
+          <w:rFonts w:ascii="Segoe UI Emoji" w:eastAsia="Times New Roman" w:hAnsi="Segoe UI Emoji" w:cs="Segoe UI Emoji"/>
           <w:kern w:val="0"/>
           <w:sz w:val="24"/>
           <w:szCs w:val="24"/>
@@ -6885,6 +6912,750 @@
           <w14:ligatures w14:val="none"/>
         </w:rPr>
         <w:t>💚</w:t>
+      </w:r>
+      <w:r>
+        <w:rPr>
+          <w:rFonts w:ascii="Segoe UI Emoji" w:eastAsia="Times New Roman" w:hAnsi="Segoe UI Emoji" w:cs="Segoe UI Emoji"/>
+          <w:kern w:val="0"/>
+          <w:sz w:val="24"/>
+          <w:szCs w:val="24"/>
+          <w:lang w:eastAsia="es-MX"/>
+          <w14:ligatures w14:val="none"/>
+        </w:rPr>
+        <w:br/>
+      </w:r>
+    </w:p>
+    <w:p>
+      <w:pPr>
+        <w:rPr>
+          <w:rFonts w:ascii="Segoe UI Emoji" w:eastAsia="Times New Roman" w:hAnsi="Segoe UI Emoji" w:cs="Segoe UI Emoji"/>
+          <w:kern w:val="0"/>
+          <w:sz w:val="24"/>
+          <w:szCs w:val="24"/>
+          <w:lang w:eastAsia="es-MX"/>
+          <w14:ligatures w14:val="none"/>
+        </w:rPr>
+      </w:pPr>
+      <w:r>
+        <w:rPr>
+          <w:rFonts w:ascii="Segoe UI Emoji" w:eastAsia="Times New Roman" w:hAnsi="Segoe UI Emoji" w:cs="Segoe UI Emoji"/>
+          <w:kern w:val="0"/>
+          <w:sz w:val="24"/>
+          <w:szCs w:val="24"/>
+          <w:lang w:eastAsia="es-MX"/>
+          <w14:ligatures w14:val="none"/>
+        </w:rPr>
+        <w:br w:type="page"/>
+      </w:r>
+    </w:p>
+    <w:p>
+      <w:pPr>
+        <w:spacing w:before="100" w:beforeAutospacing="1" w:after="100" w:afterAutospacing="1" w:line="240" w:lineRule="auto"/>
+        <w:rPr>
+          <w:rFonts w:ascii="Times New Roman" w:eastAsia="Times New Roman" w:hAnsi="Times New Roman" w:cs="Times New Roman"/>
+          <w:kern w:val="0"/>
+          <w:sz w:val="24"/>
+          <w:szCs w:val="24"/>
+          <w:lang w:eastAsia="es-MX"/>
+          <w14:ligatures w14:val="none"/>
+        </w:rPr>
+      </w:pPr>
+      <w:r>
+        <w:rPr>
+          <w:rFonts w:ascii="Times New Roman" w:eastAsia="Times New Roman" w:hAnsi="Times New Roman" w:cs="Times New Roman"/>
+          <w:b/>
+          <w:bCs/>
+          <w:kern w:val="0"/>
+          <w:sz w:val="24"/>
+          <w:szCs w:val="24"/>
+          <w:lang w:eastAsia="es-MX"/>
+          <w14:ligatures w14:val="none"/>
+        </w:rPr>
+        <w:lastRenderedPageBreak/>
+        <w:t>1. Cocina</w:t>
+      </w:r>
+      <w:r>
+        <w:rPr>
+          <w:rFonts w:ascii="Times New Roman" w:eastAsia="Times New Roman" w:hAnsi="Times New Roman" w:cs="Times New Roman"/>
+          <w:kern w:val="0"/>
+          <w:sz w:val="24"/>
+          <w:szCs w:val="24"/>
+          <w:lang w:eastAsia="es-MX"/>
+          <w14:ligatures w14:val="none"/>
+        </w:rPr>
+        <w:t xml:space="preserve"> — Cafeteras, coladores de acero, ollas de acero, bandejas de acero, tazones de acero, dispensador de aceite, jarras medidoras, </w:t>
+      </w:r>
+      <w:proofErr w:type="spellStart"/>
+      <w:r>
+        <w:rPr>
+          <w:rFonts w:ascii="Times New Roman" w:eastAsia="Times New Roman" w:hAnsi="Times New Roman" w:cs="Times New Roman"/>
+          <w:kern w:val="0"/>
+          <w:sz w:val="24"/>
+          <w:szCs w:val="24"/>
+          <w:lang w:eastAsia="es-MX"/>
+          <w14:ligatures w14:val="none"/>
+        </w:rPr>
+        <w:t>infusoras</w:t>
+      </w:r>
+      <w:proofErr w:type="spellEnd"/>
+      <w:r>
+        <w:rPr>
+          <w:rFonts w:ascii="Times New Roman" w:eastAsia="Times New Roman" w:hAnsi="Times New Roman" w:cs="Times New Roman"/>
+          <w:kern w:val="0"/>
+          <w:sz w:val="24"/>
+          <w:szCs w:val="24"/>
+          <w:lang w:eastAsia="es-MX"/>
+          <w14:ligatures w14:val="none"/>
+        </w:rPr>
+        <w:t>, tablas para picar, porta leche, exprimidor de limones/</w:t>
+      </w:r>
+      <w:proofErr w:type="spellStart"/>
+      <w:r>
+        <w:rPr>
+          <w:rFonts w:ascii="Times New Roman" w:eastAsia="Times New Roman" w:hAnsi="Times New Roman" w:cs="Times New Roman"/>
+          <w:kern w:val="0"/>
+          <w:sz w:val="24"/>
+          <w:szCs w:val="24"/>
+          <w:lang w:eastAsia="es-MX"/>
+          <w14:ligatures w14:val="none"/>
+        </w:rPr>
+        <w:t>portaservilletas</w:t>
+      </w:r>
+      <w:proofErr w:type="spellEnd"/>
+      <w:r>
+        <w:rPr>
+          <w:rFonts w:ascii="Times New Roman" w:eastAsia="Times New Roman" w:hAnsi="Times New Roman" w:cs="Times New Roman"/>
+          <w:kern w:val="0"/>
+          <w:sz w:val="24"/>
+          <w:szCs w:val="24"/>
+          <w:lang w:eastAsia="es-MX"/>
+          <w14:ligatures w14:val="none"/>
+        </w:rPr>
+        <w:t>.</w:t>
+      </w:r>
+    </w:p>
+    <w:p>
+      <w:pPr>
+        <w:spacing w:before="100" w:beforeAutospacing="1" w:after="100" w:afterAutospacing="1" w:line="240" w:lineRule="auto"/>
+        <w:rPr>
+          <w:rFonts w:ascii="Times New Roman" w:eastAsia="Times New Roman" w:hAnsi="Times New Roman" w:cs="Times New Roman"/>
+          <w:kern w:val="0"/>
+          <w:sz w:val="24"/>
+          <w:szCs w:val="24"/>
+          <w:lang w:eastAsia="es-MX"/>
+          <w14:ligatures w14:val="none"/>
+        </w:rPr>
+      </w:pPr>
+      <w:r>
+        <w:rPr>
+          <w:rFonts w:ascii="Times New Roman" w:eastAsia="Times New Roman" w:hAnsi="Times New Roman" w:cs="Times New Roman"/>
+          <w:b/>
+          <w:bCs/>
+          <w:kern w:val="0"/>
+          <w:sz w:val="24"/>
+          <w:szCs w:val="24"/>
+          <w:lang w:eastAsia="es-MX"/>
+          <w14:ligatures w14:val="none"/>
+        </w:rPr>
+        <w:t>2. Vajilla y Platos</w:t>
+      </w:r>
+      <w:r>
+        <w:rPr>
+          <w:rFonts w:ascii="Times New Roman" w:eastAsia="Times New Roman" w:hAnsi="Times New Roman" w:cs="Times New Roman"/>
+          <w:kern w:val="0"/>
+          <w:sz w:val="24"/>
+          <w:szCs w:val="24"/>
+          <w:lang w:eastAsia="es-MX"/>
+          <w14:ligatures w14:val="none"/>
+        </w:rPr>
+        <w:t xml:space="preserve"> — Platos cerámica, </w:t>
+      </w:r>
+      <w:proofErr w:type="spellStart"/>
+      <w:r>
+        <w:rPr>
+          <w:rFonts w:ascii="Times New Roman" w:eastAsia="Times New Roman" w:hAnsi="Times New Roman" w:cs="Times New Roman"/>
+          <w:kern w:val="0"/>
+          <w:sz w:val="24"/>
+          <w:szCs w:val="24"/>
+          <w:lang w:eastAsia="es-MX"/>
+          <w14:ligatures w14:val="none"/>
+        </w:rPr>
+        <w:t>melamine</w:t>
+      </w:r>
+      <w:proofErr w:type="spellEnd"/>
+      <w:r>
+        <w:rPr>
+          <w:rFonts w:ascii="Times New Roman" w:eastAsia="Times New Roman" w:hAnsi="Times New Roman" w:cs="Times New Roman"/>
+          <w:kern w:val="0"/>
+          <w:sz w:val="24"/>
+          <w:szCs w:val="24"/>
+          <w:lang w:eastAsia="es-MX"/>
+          <w14:ligatures w14:val="none"/>
+        </w:rPr>
+        <w:t>, opal, tazas de cerámica, copas, vasos, cristalería, cubiertos</w:t>
+      </w:r>
+    </w:p>
+    <w:p>
+      <w:pPr>
+        <w:spacing w:before="100" w:beforeAutospacing="1" w:after="100" w:afterAutospacing="1" w:line="240" w:lineRule="auto"/>
+        <w:rPr>
+          <w:rFonts w:ascii="Times New Roman" w:eastAsia="Times New Roman" w:hAnsi="Times New Roman" w:cs="Times New Roman"/>
+          <w:kern w:val="0"/>
+          <w:sz w:val="24"/>
+          <w:szCs w:val="24"/>
+          <w:lang w:eastAsia="es-MX"/>
+          <w14:ligatures w14:val="none"/>
+        </w:rPr>
+      </w:pPr>
+      <w:r>
+        <w:rPr>
+          <w:rFonts w:ascii="Times New Roman" w:eastAsia="Times New Roman" w:hAnsi="Times New Roman" w:cs="Times New Roman"/>
+          <w:b/>
+          <w:bCs/>
+          <w:kern w:val="0"/>
+          <w:sz w:val="24"/>
+          <w:szCs w:val="24"/>
+          <w:lang w:eastAsia="es-MX"/>
+          <w14:ligatures w14:val="none"/>
+        </w:rPr>
+        <w:t>4. Decoración</w:t>
+      </w:r>
+      <w:r>
+        <w:rPr>
+          <w:rFonts w:ascii="Times New Roman" w:eastAsia="Times New Roman" w:hAnsi="Times New Roman" w:cs="Times New Roman"/>
+          <w:kern w:val="0"/>
+          <w:sz w:val="24"/>
+          <w:szCs w:val="24"/>
+          <w:lang w:eastAsia="es-MX"/>
+          <w14:ligatures w14:val="none"/>
+        </w:rPr>
+        <w:t xml:space="preserve"> — Floreros de madera, floreros de vidrio, espejos acrílicos, </w:t>
+      </w:r>
+      <w:proofErr w:type="spellStart"/>
+      <w:r>
+        <w:rPr>
+          <w:rFonts w:ascii="Times New Roman" w:eastAsia="Times New Roman" w:hAnsi="Times New Roman" w:cs="Times New Roman"/>
+          <w:kern w:val="0"/>
+          <w:sz w:val="24"/>
+          <w:szCs w:val="24"/>
+          <w:lang w:eastAsia="es-MX"/>
+          <w14:ligatures w14:val="none"/>
+        </w:rPr>
+        <w:t>portaretratos</w:t>
+      </w:r>
+      <w:proofErr w:type="spellEnd"/>
+      <w:r>
+        <w:rPr>
+          <w:rFonts w:ascii="Times New Roman" w:eastAsia="Times New Roman" w:hAnsi="Times New Roman" w:cs="Times New Roman"/>
+          <w:kern w:val="0"/>
+          <w:sz w:val="24"/>
+          <w:szCs w:val="24"/>
+          <w:lang w:eastAsia="es-MX"/>
+          <w14:ligatures w14:val="none"/>
+        </w:rPr>
+        <w:t>, porta retratos de vidrio, piedras decorativas, chimeneas LED, vallas y césped decorativo</w:t>
+      </w:r>
+      <w:proofErr w:type="gramStart"/>
+      <w:r>
+        <w:rPr>
+          <w:rFonts w:ascii="Times New Roman" w:eastAsia="Times New Roman" w:hAnsi="Times New Roman" w:cs="Times New Roman"/>
+          <w:kern w:val="0"/>
+          <w:sz w:val="24"/>
+          <w:szCs w:val="24"/>
+          <w:lang w:eastAsia="es-MX"/>
+          <w14:ligatures w14:val="none"/>
+        </w:rPr>
+        <w:t>, ,</w:t>
+      </w:r>
+      <w:proofErr w:type="gramEnd"/>
+      <w:r>
+        <w:rPr>
+          <w:rFonts w:ascii="Times New Roman" w:eastAsia="Times New Roman" w:hAnsi="Times New Roman" w:cs="Times New Roman"/>
+          <w:kern w:val="0"/>
+          <w:sz w:val="24"/>
+          <w:szCs w:val="24"/>
+          <w:lang w:eastAsia="es-MX"/>
+          <w14:ligatures w14:val="none"/>
+        </w:rPr>
+        <w:t xml:space="preserve"> bailarinas de repostería</w:t>
+      </w:r>
+      <w:r>
+        <w:rPr>
+          <w:rFonts w:ascii="Times New Roman" w:eastAsia="Times New Roman" w:hAnsi="Times New Roman" w:cs="Times New Roman"/>
+          <w:kern w:val="0"/>
+          <w:sz w:val="24"/>
+          <w:szCs w:val="24"/>
+          <w:lang w:eastAsia="es-MX"/>
+          <w14:ligatures w14:val="none"/>
+        </w:rPr>
+        <w:t>, a</w:t>
+      </w:r>
+      <w:r>
+        <w:rPr>
+          <w:rFonts w:ascii="Times New Roman" w:eastAsia="Times New Roman" w:hAnsi="Times New Roman" w:cs="Times New Roman"/>
+          <w:kern w:val="0"/>
+          <w:sz w:val="24"/>
+          <w:szCs w:val="24"/>
+          <w:lang w:eastAsia="es-MX"/>
+          <w14:ligatures w14:val="none"/>
+        </w:rPr>
+        <w:t>lfombras, cortinas para baño</w:t>
+      </w:r>
+      <w:r>
+        <w:rPr>
+          <w:rFonts w:ascii="Times New Roman" w:eastAsia="Times New Roman" w:hAnsi="Times New Roman" w:cs="Times New Roman"/>
+          <w:kern w:val="0"/>
+          <w:sz w:val="24"/>
+          <w:szCs w:val="24"/>
+          <w:lang w:eastAsia="es-MX"/>
+          <w14:ligatures w14:val="none"/>
+        </w:rPr>
+        <w:t>,</w:t>
+      </w:r>
+      <w:r>
+        <w:rPr>
+          <w:rFonts w:ascii="Times New Roman" w:eastAsia="Times New Roman" w:hAnsi="Times New Roman" w:cs="Times New Roman"/>
+          <w:kern w:val="0"/>
+          <w:sz w:val="24"/>
+          <w:szCs w:val="24"/>
+          <w:lang w:eastAsia="es-MX"/>
+          <w14:ligatures w14:val="none"/>
+        </w:rPr>
+        <w:t xml:space="preserve"> </w:t>
+      </w:r>
+      <w:r>
+        <w:rPr>
+          <w:rFonts w:ascii="Times New Roman" w:eastAsia="Times New Roman" w:hAnsi="Times New Roman" w:cs="Times New Roman"/>
+          <w:kern w:val="0"/>
+          <w:sz w:val="24"/>
+          <w:szCs w:val="24"/>
+          <w:lang w:eastAsia="es-MX"/>
+          <w14:ligatures w14:val="none"/>
+        </w:rPr>
+        <w:t>vinil adhesivo</w:t>
+      </w:r>
+    </w:p>
+    <w:p>
+      <w:pPr>
+        <w:spacing w:before="100" w:beforeAutospacing="1" w:after="100" w:afterAutospacing="1" w:line="240" w:lineRule="auto"/>
+        <w:rPr>
+          <w:rFonts w:ascii="Times New Roman" w:eastAsia="Times New Roman" w:hAnsi="Times New Roman" w:cs="Times New Roman"/>
+          <w:kern w:val="0"/>
+          <w:sz w:val="24"/>
+          <w:szCs w:val="24"/>
+          <w:lang w:eastAsia="es-MX"/>
+          <w14:ligatures w14:val="none"/>
+        </w:rPr>
+      </w:pPr>
+      <w:r>
+        <w:rPr>
+          <w:rFonts w:ascii="Times New Roman" w:eastAsia="Times New Roman" w:hAnsi="Times New Roman" w:cs="Times New Roman"/>
+          <w:b/>
+          <w:bCs/>
+          <w:kern w:val="0"/>
+          <w:sz w:val="24"/>
+          <w:szCs w:val="24"/>
+          <w:lang w:eastAsia="es-MX"/>
+          <w14:ligatures w14:val="none"/>
+        </w:rPr>
+        <w:t>5. Organización del hogar</w:t>
+      </w:r>
+      <w:r>
+        <w:rPr>
+          <w:rFonts w:ascii="Times New Roman" w:eastAsia="Times New Roman" w:hAnsi="Times New Roman" w:cs="Times New Roman"/>
+          <w:kern w:val="0"/>
+          <w:sz w:val="24"/>
+          <w:szCs w:val="24"/>
+          <w:lang w:eastAsia="es-MX"/>
+          <w14:ligatures w14:val="none"/>
+        </w:rPr>
+        <w:t xml:space="preserve"> — Estantes, ganchos, plateras, basureros, zapateras, soportes de TV, mesas, frascos de vidrio, </w:t>
+      </w:r>
+    </w:p>
+    <w:p>
+      <w:pPr>
+        <w:spacing w:before="100" w:beforeAutospacing="1" w:after="100" w:afterAutospacing="1" w:line="240" w:lineRule="auto"/>
+        <w:rPr>
+          <w:rFonts w:ascii="Times New Roman" w:eastAsia="Times New Roman" w:hAnsi="Times New Roman" w:cs="Times New Roman"/>
+          <w:kern w:val="0"/>
+          <w:sz w:val="24"/>
+          <w:szCs w:val="24"/>
+          <w:lang w:eastAsia="es-MX"/>
+          <w14:ligatures w14:val="none"/>
+        </w:rPr>
+      </w:pPr>
+      <w:r>
+        <w:rPr>
+          <w:rFonts w:ascii="Times New Roman" w:eastAsia="Times New Roman" w:hAnsi="Times New Roman" w:cs="Times New Roman"/>
+          <w:b/>
+          <w:bCs/>
+          <w:kern w:val="0"/>
+          <w:sz w:val="24"/>
+          <w:szCs w:val="24"/>
+          <w:lang w:eastAsia="es-MX"/>
+          <w14:ligatures w14:val="none"/>
+        </w:rPr>
+        <w:t>6. Limpieza</w:t>
+      </w:r>
+      <w:r>
+        <w:rPr>
+          <w:rFonts w:ascii="Times New Roman" w:eastAsia="Times New Roman" w:hAnsi="Times New Roman" w:cs="Times New Roman"/>
+          <w:kern w:val="0"/>
+          <w:sz w:val="24"/>
+          <w:szCs w:val="24"/>
+          <w:lang w:eastAsia="es-MX"/>
+          <w14:ligatures w14:val="none"/>
+        </w:rPr>
+        <w:t xml:space="preserve"> — Trapeadores, limpia vidrios, tablas para planchar, atrapamoscas</w:t>
+      </w:r>
+    </w:p>
+    <w:p>
+      <w:pPr>
+        <w:spacing w:before="100" w:beforeAutospacing="1" w:after="100" w:afterAutospacing="1" w:line="240" w:lineRule="auto"/>
+        <w:rPr>
+          <w:rFonts w:ascii="Times New Roman" w:eastAsia="Times New Roman" w:hAnsi="Times New Roman" w:cs="Times New Roman"/>
+          <w:kern w:val="0"/>
+          <w:sz w:val="24"/>
+          <w:szCs w:val="24"/>
+          <w:lang w:eastAsia="es-MX"/>
+          <w14:ligatures w14:val="none"/>
+        </w:rPr>
+      </w:pPr>
+      <w:r>
+        <w:rPr>
+          <w:rFonts w:ascii="Times New Roman" w:eastAsia="Times New Roman" w:hAnsi="Times New Roman" w:cs="Times New Roman"/>
+          <w:b/>
+          <w:bCs/>
+          <w:kern w:val="0"/>
+          <w:sz w:val="24"/>
+          <w:szCs w:val="24"/>
+          <w:lang w:eastAsia="es-MX"/>
+          <w14:ligatures w14:val="none"/>
+        </w:rPr>
+        <w:t>7. Deportes y Fitness</w:t>
+      </w:r>
+      <w:r>
+        <w:rPr>
+          <w:rFonts w:ascii="Times New Roman" w:eastAsia="Times New Roman" w:hAnsi="Times New Roman" w:cs="Times New Roman"/>
+          <w:kern w:val="0"/>
+          <w:sz w:val="24"/>
+          <w:szCs w:val="24"/>
+          <w:lang w:eastAsia="es-MX"/>
+          <w14:ligatures w14:val="none"/>
+        </w:rPr>
+        <w:t xml:space="preserve"> — Balones, bandas de yoga, conos, pelotas de yoga, patines, scooter, fitness, tomatodos, deportes</w:t>
+      </w:r>
+    </w:p>
+    <w:p>
+      <w:pPr>
+        <w:spacing w:before="100" w:beforeAutospacing="1" w:after="100" w:afterAutospacing="1" w:line="240" w:lineRule="auto"/>
+        <w:rPr>
+          <w:rFonts w:ascii="Times New Roman" w:eastAsia="Times New Roman" w:hAnsi="Times New Roman" w:cs="Times New Roman"/>
+          <w:kern w:val="0"/>
+          <w:sz w:val="24"/>
+          <w:szCs w:val="24"/>
+          <w:lang w:eastAsia="es-MX"/>
+          <w14:ligatures w14:val="none"/>
+        </w:rPr>
+      </w:pPr>
+      <w:r>
+        <w:rPr>
+          <w:rFonts w:ascii="Times New Roman" w:eastAsia="Times New Roman" w:hAnsi="Times New Roman" w:cs="Times New Roman"/>
+          <w:b/>
+          <w:bCs/>
+          <w:kern w:val="0"/>
+          <w:sz w:val="24"/>
+          <w:szCs w:val="24"/>
+          <w:lang w:eastAsia="es-MX"/>
+          <w14:ligatures w14:val="none"/>
+        </w:rPr>
+        <w:t>8. Salud y Cuidado Personal</w:t>
+      </w:r>
+      <w:r>
+        <w:rPr>
+          <w:rFonts w:ascii="Times New Roman" w:eastAsia="Times New Roman" w:hAnsi="Times New Roman" w:cs="Times New Roman"/>
+          <w:kern w:val="0"/>
+          <w:sz w:val="24"/>
+          <w:szCs w:val="24"/>
+          <w:lang w:eastAsia="es-MX"/>
+          <w14:ligatures w14:val="none"/>
+        </w:rPr>
+        <w:t xml:space="preserve"> — Terapia (rodilleras/fajas), bolsas de agua caliente, cepillos de dientes</w:t>
+      </w:r>
+    </w:p>
+    <w:p>
+      <w:pPr>
+        <w:spacing w:before="100" w:beforeAutospacing="1" w:after="100" w:afterAutospacing="1" w:line="240" w:lineRule="auto"/>
+        <w:rPr>
+          <w:rFonts w:ascii="Times New Roman" w:eastAsia="Times New Roman" w:hAnsi="Times New Roman" w:cs="Times New Roman"/>
+          <w:kern w:val="0"/>
+          <w:sz w:val="24"/>
+          <w:szCs w:val="24"/>
+          <w:lang w:eastAsia="es-MX"/>
+          <w14:ligatures w14:val="none"/>
+        </w:rPr>
+      </w:pPr>
+      <w:r>
+        <w:rPr>
+          <w:rFonts w:ascii="Times New Roman" w:eastAsia="Times New Roman" w:hAnsi="Times New Roman" w:cs="Times New Roman"/>
+          <w:b/>
+          <w:bCs/>
+          <w:kern w:val="0"/>
+          <w:sz w:val="24"/>
+          <w:szCs w:val="24"/>
+          <w:lang w:eastAsia="es-MX"/>
+          <w14:ligatures w14:val="none"/>
+        </w:rPr>
+        <w:t>9. Niños y Bebés</w:t>
+      </w:r>
+      <w:r>
+        <w:rPr>
+          <w:rFonts w:ascii="Times New Roman" w:eastAsia="Times New Roman" w:hAnsi="Times New Roman" w:cs="Times New Roman"/>
+          <w:kern w:val="0"/>
+          <w:sz w:val="24"/>
+          <w:szCs w:val="24"/>
+          <w:lang w:eastAsia="es-MX"/>
+          <w14:ligatures w14:val="none"/>
+        </w:rPr>
+        <w:t xml:space="preserve"> — Bebés, legos, peluches, cubo </w:t>
+      </w:r>
+      <w:proofErr w:type="spellStart"/>
+      <w:r>
+        <w:rPr>
+          <w:rFonts w:ascii="Times New Roman" w:eastAsia="Times New Roman" w:hAnsi="Times New Roman" w:cs="Times New Roman"/>
+          <w:kern w:val="0"/>
+          <w:sz w:val="24"/>
+          <w:szCs w:val="24"/>
+          <w:lang w:eastAsia="es-MX"/>
+          <w14:ligatures w14:val="none"/>
+        </w:rPr>
+        <w:t>rubik</w:t>
+      </w:r>
+      <w:proofErr w:type="spellEnd"/>
+      <w:r>
+        <w:rPr>
+          <w:rFonts w:ascii="Times New Roman" w:eastAsia="Times New Roman" w:hAnsi="Times New Roman" w:cs="Times New Roman"/>
+          <w:kern w:val="0"/>
+          <w:sz w:val="24"/>
+          <w:szCs w:val="24"/>
+          <w:lang w:eastAsia="es-MX"/>
+          <w14:ligatures w14:val="none"/>
+        </w:rPr>
+        <w:t xml:space="preserve"> (diversión), loncheras, pañaleras</w:t>
+      </w:r>
+      <w:r>
+        <w:rPr>
+          <w:rFonts w:ascii="Times New Roman" w:eastAsia="Times New Roman" w:hAnsi="Times New Roman" w:cs="Times New Roman"/>
+          <w:kern w:val="0"/>
+          <w:sz w:val="24"/>
+          <w:szCs w:val="24"/>
+          <w:lang w:eastAsia="es-MX"/>
+          <w14:ligatures w14:val="none"/>
+        </w:rPr>
+        <w:t>,</w:t>
+      </w:r>
+      <w:r>
+        <w:rPr>
+          <w:rFonts w:ascii="Times New Roman" w:eastAsia="Times New Roman" w:hAnsi="Times New Roman" w:cs="Times New Roman"/>
+          <w:kern w:val="0"/>
+          <w:sz w:val="24"/>
+          <w:szCs w:val="24"/>
+          <w:lang w:eastAsia="es-MX"/>
+          <w14:ligatures w14:val="none"/>
+        </w:rPr>
+        <w:t xml:space="preserve"> </w:t>
+      </w:r>
+      <w:r>
+        <w:rPr>
+          <w:rFonts w:ascii="Times New Roman" w:eastAsia="Times New Roman" w:hAnsi="Times New Roman" w:cs="Times New Roman"/>
+          <w:kern w:val="0"/>
+          <w:sz w:val="24"/>
+          <w:szCs w:val="24"/>
+          <w:lang w:eastAsia="es-MX"/>
+          <w14:ligatures w14:val="none"/>
+        </w:rPr>
+        <w:t>set de animalitos</w:t>
+      </w:r>
+      <w:r>
+        <w:rPr>
+          <w:rFonts w:ascii="Times New Roman" w:eastAsia="Times New Roman" w:hAnsi="Times New Roman" w:cs="Times New Roman"/>
+          <w:kern w:val="0"/>
+          <w:sz w:val="24"/>
+          <w:szCs w:val="24"/>
+          <w:lang w:eastAsia="es-MX"/>
+          <w14:ligatures w14:val="none"/>
+        </w:rPr>
+        <w:t>,</w:t>
+      </w:r>
+      <w:r>
+        <w:rPr>
+          <w:rFonts w:ascii="Times New Roman" w:eastAsia="Times New Roman" w:hAnsi="Times New Roman" w:cs="Times New Roman"/>
+          <w:kern w:val="0"/>
+          <w:sz w:val="24"/>
+          <w:szCs w:val="24"/>
+          <w:lang w:eastAsia="es-MX"/>
+          <w14:ligatures w14:val="none"/>
+        </w:rPr>
+        <w:t xml:space="preserve"> </w:t>
+      </w:r>
+      <w:r>
+        <w:rPr>
+          <w:rFonts w:ascii="Times New Roman" w:eastAsia="Times New Roman" w:hAnsi="Times New Roman" w:cs="Times New Roman"/>
+          <w:kern w:val="0"/>
+          <w:sz w:val="24"/>
+          <w:szCs w:val="24"/>
+          <w:lang w:eastAsia="es-MX"/>
+          <w14:ligatures w14:val="none"/>
+        </w:rPr>
+        <w:t>alcancías</w:t>
+      </w:r>
+    </w:p>
+    <w:p>
+      <w:pPr>
+        <w:spacing w:before="100" w:beforeAutospacing="1" w:after="100" w:afterAutospacing="1" w:line="240" w:lineRule="auto"/>
+        <w:rPr>
+          <w:rFonts w:ascii="Times New Roman" w:eastAsia="Times New Roman" w:hAnsi="Times New Roman" w:cs="Times New Roman"/>
+          <w:kern w:val="0"/>
+          <w:sz w:val="24"/>
+          <w:szCs w:val="24"/>
+          <w:lang w:eastAsia="es-MX"/>
+          <w14:ligatures w14:val="none"/>
+        </w:rPr>
+      </w:pPr>
+      <w:r>
+        <w:rPr>
+          <w:rFonts w:ascii="Times New Roman" w:eastAsia="Times New Roman" w:hAnsi="Times New Roman" w:cs="Times New Roman"/>
+          <w:b/>
+          <w:bCs/>
+          <w:kern w:val="0"/>
+          <w:sz w:val="24"/>
+          <w:szCs w:val="24"/>
+          <w:lang w:eastAsia="es-MX"/>
+          <w14:ligatures w14:val="none"/>
+        </w:rPr>
+        <w:t>10. Viaje y Accesorios</w:t>
+      </w:r>
+      <w:r>
+        <w:rPr>
+          <w:rFonts w:ascii="Times New Roman" w:eastAsia="Times New Roman" w:hAnsi="Times New Roman" w:cs="Times New Roman"/>
+          <w:kern w:val="0"/>
+          <w:sz w:val="24"/>
+          <w:szCs w:val="24"/>
+          <w:lang w:eastAsia="es-MX"/>
+          <w14:ligatures w14:val="none"/>
+        </w:rPr>
+        <w:t xml:space="preserve"> — Almohadas de viaje, paraguas, parasoles, mochilas, hieleras</w:t>
+      </w:r>
+    </w:p>
+    <w:p>
+      <w:pPr>
+        <w:spacing w:before="100" w:beforeAutospacing="1" w:after="100" w:afterAutospacing="1" w:line="240" w:lineRule="auto"/>
+        <w:rPr>
+          <w:rFonts w:ascii="Times New Roman" w:eastAsia="Times New Roman" w:hAnsi="Times New Roman" w:cs="Times New Roman"/>
+          <w:kern w:val="0"/>
+          <w:sz w:val="24"/>
+          <w:szCs w:val="24"/>
+          <w:lang w:eastAsia="es-MX"/>
+          <w14:ligatures w14:val="none"/>
+        </w:rPr>
+      </w:pPr>
+      <w:r>
+        <w:rPr>
+          <w:rFonts w:ascii="Times New Roman" w:eastAsia="Times New Roman" w:hAnsi="Times New Roman" w:cs="Times New Roman"/>
+          <w:b/>
+          <w:bCs/>
+          <w:kern w:val="0"/>
+          <w:sz w:val="24"/>
+          <w:szCs w:val="24"/>
+          <w:lang w:eastAsia="es-MX"/>
+          <w14:ligatures w14:val="none"/>
+        </w:rPr>
+        <w:t>11. Mascotas</w:t>
+      </w:r>
+      <w:r>
+        <w:rPr>
+          <w:rFonts w:ascii="Times New Roman" w:eastAsia="Times New Roman" w:hAnsi="Times New Roman" w:cs="Times New Roman"/>
+          <w:kern w:val="0"/>
+          <w:sz w:val="24"/>
+          <w:szCs w:val="24"/>
+          <w:lang w:eastAsia="es-MX"/>
+          <w14:ligatures w14:val="none"/>
+        </w:rPr>
+        <w:t xml:space="preserve"> — Mascotas</w:t>
+      </w:r>
+    </w:p>
+    <w:p>
+      <w:pPr>
+        <w:spacing w:before="100" w:beforeAutospacing="1" w:after="100" w:afterAutospacing="1" w:line="240" w:lineRule="auto"/>
+        <w:rPr>
+          <w:rFonts w:ascii="Times New Roman" w:eastAsia="Times New Roman" w:hAnsi="Times New Roman" w:cs="Times New Roman"/>
+          <w:kern w:val="0"/>
+          <w:sz w:val="24"/>
+          <w:szCs w:val="24"/>
+          <w:lang w:eastAsia="es-MX"/>
+          <w14:ligatures w14:val="none"/>
+        </w:rPr>
+      </w:pPr>
+      <w:r>
+        <w:rPr>
+          <w:rFonts w:ascii="Times New Roman" w:eastAsia="Times New Roman" w:hAnsi="Times New Roman" w:cs="Times New Roman"/>
+          <w:b/>
+          <w:bCs/>
+          <w:kern w:val="0"/>
+          <w:sz w:val="24"/>
+          <w:szCs w:val="24"/>
+          <w:lang w:eastAsia="es-MX"/>
+          <w14:ligatures w14:val="none"/>
+        </w:rPr>
+        <w:t>12. Ferretería</w:t>
+      </w:r>
+      <w:r>
+        <w:rPr>
+          <w:rFonts w:ascii="Times New Roman" w:eastAsia="Times New Roman" w:hAnsi="Times New Roman" w:cs="Times New Roman"/>
+          <w:kern w:val="0"/>
+          <w:sz w:val="24"/>
+          <w:szCs w:val="24"/>
+          <w:lang w:eastAsia="es-MX"/>
+          <w14:ligatures w14:val="none"/>
+        </w:rPr>
+        <w:t xml:space="preserve"> — Ferretería, </w:t>
+      </w:r>
+    </w:p>
+    <w:p>
+      <w:pPr>
+        <w:spacing w:before="100" w:beforeAutospacing="1" w:after="100" w:afterAutospacing="1" w:line="240" w:lineRule="auto"/>
+        <w:rPr>
+          <w:rFonts w:ascii="Times New Roman" w:eastAsia="Times New Roman" w:hAnsi="Times New Roman" w:cs="Times New Roman"/>
+          <w:kern w:val="0"/>
+          <w:sz w:val="24"/>
+          <w:szCs w:val="24"/>
+          <w:lang w:eastAsia="es-MX"/>
+          <w14:ligatures w14:val="none"/>
+        </w:rPr>
+      </w:pPr>
+      <w:r>
+        <w:rPr>
+          <w:rFonts w:ascii="Times New Roman" w:eastAsia="Times New Roman" w:hAnsi="Times New Roman" w:cs="Times New Roman"/>
+          <w:b/>
+          <w:bCs/>
+          <w:kern w:val="0"/>
+          <w:sz w:val="24"/>
+          <w:szCs w:val="24"/>
+          <w:lang w:eastAsia="es-MX"/>
+          <w14:ligatures w14:val="none"/>
+        </w:rPr>
+        <w:t>13. Electrodomésticos y Electrónica</w:t>
+      </w:r>
+      <w:r>
+        <w:rPr>
+          <w:rFonts w:ascii="Times New Roman" w:eastAsia="Times New Roman" w:hAnsi="Times New Roman" w:cs="Times New Roman"/>
+          <w:kern w:val="0"/>
+          <w:sz w:val="24"/>
+          <w:szCs w:val="24"/>
+          <w:lang w:eastAsia="es-MX"/>
+          <w14:ligatures w14:val="none"/>
+        </w:rPr>
+        <w:t xml:space="preserve"> — Ventiladores, parlantes</w:t>
       </w:r>
     </w:p>
     <w:sectPr>
@@ -7198,9 +7969,9 @@
     </w:lvl>
   </w:abstractNum>
   <w:abstractNum w:abstractNumId="2" w15:restartNumberingAfterBreak="0">
-    <w:nsid w:val="24477077"/>
+    <w:nsid w:val="1417585E"/>
     <w:multiLevelType w:val="multilevel"/>
-    <w:tmpl w:val="996C484E"/>
+    <w:tmpl w:val="C86C4F3E"/>
     <w:lvl w:ilvl="0">
       <w:start w:val="1"/>
       <w:numFmt w:val="bullet"/>
@@ -7347,9 +8118,9 @@
     </w:lvl>
   </w:abstractNum>
   <w:abstractNum w:abstractNumId="3" w15:restartNumberingAfterBreak="0">
-    <w:nsid w:val="3F167870"/>
+    <w:nsid w:val="24477077"/>
     <w:multiLevelType w:val="multilevel"/>
-    <w:tmpl w:val="83746460"/>
+    <w:tmpl w:val="996C484E"/>
     <w:lvl w:ilvl="0">
       <w:start w:val="1"/>
       <w:numFmt w:val="bullet"/>
@@ -7496,9 +8267,9 @@
     </w:lvl>
   </w:abstractNum>
   <w:abstractNum w:abstractNumId="4" w15:restartNumberingAfterBreak="0">
-    <w:nsid w:val="63D65DB3"/>
+    <w:nsid w:val="3F167870"/>
     <w:multiLevelType w:val="multilevel"/>
-    <w:tmpl w:val="B3EC0562"/>
+    <w:tmpl w:val="83746460"/>
     <w:lvl w:ilvl="0">
       <w:start w:val="1"/>
       <w:numFmt w:val="bullet"/>
@@ -7645,9 +8416,9 @@
     </w:lvl>
   </w:abstractNum>
   <w:abstractNum w:abstractNumId="5" w15:restartNumberingAfterBreak="0">
-    <w:nsid w:val="68F131CC"/>
+    <w:nsid w:val="63D65DB3"/>
     <w:multiLevelType w:val="multilevel"/>
-    <w:tmpl w:val="58E0F28C"/>
+    <w:tmpl w:val="B3EC0562"/>
     <w:lvl w:ilvl="0">
       <w:start w:val="1"/>
       <w:numFmt w:val="bullet"/>
@@ -7794,9 +8565,9 @@
     </w:lvl>
   </w:abstractNum>
   <w:abstractNum w:abstractNumId="6" w15:restartNumberingAfterBreak="0">
-    <w:nsid w:val="6C164DFF"/>
+    <w:nsid w:val="68F131CC"/>
     <w:multiLevelType w:val="multilevel"/>
-    <w:tmpl w:val="CFB62C58"/>
+    <w:tmpl w:val="58E0F28C"/>
     <w:lvl w:ilvl="0">
       <w:start w:val="1"/>
       <w:numFmt w:val="bullet"/>
@@ -7943,6 +8714,155 @@
     </w:lvl>
   </w:abstractNum>
   <w:abstractNum w:abstractNumId="7" w15:restartNumberingAfterBreak="0">
+    <w:nsid w:val="6C164DFF"/>
+    <w:multiLevelType w:val="multilevel"/>
+    <w:tmpl w:val="CFB62C58"/>
+    <w:lvl w:ilvl="0">
+      <w:start w:val="1"/>
+      <w:numFmt w:val="bullet"/>
+      <w:lvlText w:val=""/>
+      <w:lvlJc w:val="left"/>
+      <w:pPr>
+        <w:tabs>
+          <w:tab w:val="num" w:pos="720"/>
+        </w:tabs>
+        <w:ind w:left="720" w:hanging="360"/>
+      </w:pPr>
+      <w:rPr>
+        <w:rFonts w:ascii="Symbol" w:hAnsi="Symbol" w:hint="default"/>
+        <w:sz w:val="20"/>
+      </w:rPr>
+    </w:lvl>
+    <w:lvl w:ilvl="1" w:tentative="1">
+      <w:start w:val="1"/>
+      <w:numFmt w:val="bullet"/>
+      <w:lvlText w:val="o"/>
+      <w:lvlJc w:val="left"/>
+      <w:pPr>
+        <w:tabs>
+          <w:tab w:val="num" w:pos="1440"/>
+        </w:tabs>
+        <w:ind w:left="1440" w:hanging="360"/>
+      </w:pPr>
+      <w:rPr>
+        <w:rFonts w:ascii="Courier New" w:hAnsi="Courier New" w:hint="default"/>
+        <w:sz w:val="20"/>
+      </w:rPr>
+    </w:lvl>
+    <w:lvl w:ilvl="2" w:tentative="1">
+      <w:start w:val="1"/>
+      <w:numFmt w:val="bullet"/>
+      <w:lvlText w:val=""/>
+      <w:lvlJc w:val="left"/>
+      <w:pPr>
+        <w:tabs>
+          <w:tab w:val="num" w:pos="2160"/>
+        </w:tabs>
+        <w:ind w:left="2160" w:hanging="360"/>
+      </w:pPr>
+      <w:rPr>
+        <w:rFonts w:ascii="Wingdings" w:hAnsi="Wingdings" w:hint="default"/>
+        <w:sz w:val="20"/>
+      </w:rPr>
+    </w:lvl>
+    <w:lvl w:ilvl="3" w:tentative="1">
+      <w:start w:val="1"/>
+      <w:numFmt w:val="bullet"/>
+      <w:lvlText w:val=""/>
+      <w:lvlJc w:val="left"/>
+      <w:pPr>
+        <w:tabs>
+          <w:tab w:val="num" w:pos="2880"/>
+        </w:tabs>
+        <w:ind w:left="2880" w:hanging="360"/>
+      </w:pPr>
+      <w:rPr>
+        <w:rFonts w:ascii="Wingdings" w:hAnsi="Wingdings" w:hint="default"/>
+        <w:sz w:val="20"/>
+      </w:rPr>
+    </w:lvl>
+    <w:lvl w:ilvl="4" w:tentative="1">
+      <w:start w:val="1"/>
+      <w:numFmt w:val="bullet"/>
+      <w:lvlText w:val=""/>
+      <w:lvlJc w:val="left"/>
+      <w:pPr>
+        <w:tabs>
+          <w:tab w:val="num" w:pos="3600"/>
+        </w:tabs>
+        <w:ind w:left="3600" w:hanging="360"/>
+      </w:pPr>
+      <w:rPr>
+        <w:rFonts w:ascii="Wingdings" w:hAnsi="Wingdings" w:hint="default"/>
+        <w:sz w:val="20"/>
+      </w:rPr>
+    </w:lvl>
+    <w:lvl w:ilvl="5" w:tentative="1">
+      <w:start w:val="1"/>
+      <w:numFmt w:val="bullet"/>
+      <w:lvlText w:val=""/>
+      <w:lvlJc w:val="left"/>
+      <w:pPr>
+        <w:tabs>
+          <w:tab w:val="num" w:pos="4320"/>
+        </w:tabs>
+        <w:ind w:left="4320" w:hanging="360"/>
+      </w:pPr>
+      <w:rPr>
+        <w:rFonts w:ascii="Wingdings" w:hAnsi="Wingdings" w:hint="default"/>
+        <w:sz w:val="20"/>
+      </w:rPr>
+    </w:lvl>
+    <w:lvl w:ilvl="6" w:tentative="1">
+      <w:start w:val="1"/>
+      <w:numFmt w:val="bullet"/>
+      <w:lvlText w:val=""/>
+      <w:lvlJc w:val="left"/>
+      <w:pPr>
+        <w:tabs>
+          <w:tab w:val="num" w:pos="5040"/>
+        </w:tabs>
+        <w:ind w:left="5040" w:hanging="360"/>
+      </w:pPr>
+      <w:rPr>
+        <w:rFonts w:ascii="Wingdings" w:hAnsi="Wingdings" w:hint="default"/>
+        <w:sz w:val="20"/>
+      </w:rPr>
+    </w:lvl>
+    <w:lvl w:ilvl="7" w:tentative="1">
+      <w:start w:val="1"/>
+      <w:numFmt w:val="bullet"/>
+      <w:lvlText w:val=""/>
+      <w:lvlJc w:val="left"/>
+      <w:pPr>
+        <w:tabs>
+          <w:tab w:val="num" w:pos="5760"/>
+        </w:tabs>
+        <w:ind w:left="5760" w:hanging="360"/>
+      </w:pPr>
+      <w:rPr>
+        <w:rFonts w:ascii="Wingdings" w:hAnsi="Wingdings" w:hint="default"/>
+        <w:sz w:val="20"/>
+      </w:rPr>
+    </w:lvl>
+    <w:lvl w:ilvl="8" w:tentative="1">
+      <w:start w:val="1"/>
+      <w:numFmt w:val="bullet"/>
+      <w:lvlText w:val=""/>
+      <w:lvlJc w:val="left"/>
+      <w:pPr>
+        <w:tabs>
+          <w:tab w:val="num" w:pos="6480"/>
+        </w:tabs>
+        <w:ind w:left="6480" w:hanging="360"/>
+      </w:pPr>
+      <w:rPr>
+        <w:rFonts w:ascii="Wingdings" w:hAnsi="Wingdings" w:hint="default"/>
+        <w:sz w:val="20"/>
+      </w:rPr>
+    </w:lvl>
+  </w:abstractNum>
+  <w:abstractNum w:abstractNumId="8" w15:restartNumberingAfterBreak="0">
     <w:nsid w:val="76B37FD8"/>
     <w:multiLevelType w:val="hybridMultilevel"/>
     <w:tmpl w:val="2CDC3C12"/>
@@ -8032,19 +8952,19 @@
     </w:lvl>
   </w:abstractNum>
   <w:num w:numId="1" w16cid:durableId="1009985080">
-    <w:abstractNumId w:val="6"/>
+    <w:abstractNumId w:val="7"/>
   </w:num>
   <w:num w:numId="2" w16cid:durableId="853760857">
-    <w:abstractNumId w:val="2"/>
+    <w:abstractNumId w:val="3"/>
   </w:num>
   <w:num w:numId="3" w16cid:durableId="1663121743">
+    <w:abstractNumId w:val="5"/>
+  </w:num>
+  <w:num w:numId="4" w16cid:durableId="329405617">
     <w:abstractNumId w:val="4"/>
   </w:num>
-  <w:num w:numId="4" w16cid:durableId="329405617">
-    <w:abstractNumId w:val="3"/>
-  </w:num>
   <w:num w:numId="5" w16cid:durableId="1064834984">
-    <w:abstractNumId w:val="5"/>
+    <w:abstractNumId w:val="6"/>
   </w:num>
   <w:num w:numId="6" w16cid:durableId="1300381680">
     <w:abstractNumId w:val="1"/>
@@ -8053,7 +8973,10 @@
     <w:abstractNumId w:val="0"/>
   </w:num>
   <w:num w:numId="8" w16cid:durableId="1650473390">
-    <w:abstractNumId w:val="7"/>
+    <w:abstractNumId w:val="8"/>
+  </w:num>
+  <w:num w:numId="9" w16cid:durableId="1249657861">
+    <w:abstractNumId w:val="2"/>
   </w:num>
 </w:numbering>
 </file>

</xml_diff>

<commit_message>
Descargamos python y django para la base de datos, creamos el user y ya esta vinculado productos con la BD
</commit_message>
<xml_diff>
--- a/LEVANTAMIENTO DE DATOS.docx
+++ b/LEVANTAMIENTO DE DATOS.docx
@@ -372,31 +372,7 @@
           <w:lang w:eastAsia="es-MX"/>
           <w14:ligatures w14:val="none"/>
         </w:rPr>
-        <w:t xml:space="preserve">Pues como te digo que tienen las tiendas físicas venden a cualquier persona que paso por la tienda y le intereso o incluso también compran personas que tienen sus negocios y necesitan comprar bastante, </w:t>
-      </w:r>
-      <w:proofErr w:type="spellStart"/>
-      <w:r>
-        <w:rPr>
-          <w:rFonts w:ascii="Times New Roman" w:eastAsia="Times New Roman" w:hAnsi="Times New Roman" w:cs="Times New Roman"/>
-          <w:kern w:val="0"/>
-          <w:sz w:val="24"/>
-          <w:szCs w:val="24"/>
-          <w:lang w:eastAsia="es-MX"/>
-          <w14:ligatures w14:val="none"/>
-        </w:rPr>
-        <w:t>asi</w:t>
-      </w:r>
-      <w:proofErr w:type="spellEnd"/>
-      <w:r>
-        <w:rPr>
-          <w:rFonts w:ascii="Times New Roman" w:eastAsia="Times New Roman" w:hAnsi="Times New Roman" w:cs="Times New Roman"/>
-          <w:kern w:val="0"/>
-          <w:sz w:val="24"/>
-          <w:szCs w:val="24"/>
-          <w:lang w:eastAsia="es-MX"/>
-          <w14:ligatures w14:val="none"/>
-        </w:rPr>
-        <w:t xml:space="preserve"> q diría que venden al por mayor y menor </w:t>
+        <w:t xml:space="preserve">Pues como te digo que tienen las tiendas físicas venden a cualquier persona que paso por la tienda y le intereso o incluso también compran personas que tienen sus negocios y necesitan comprar bastante, asi q diría que venden al por mayor y menor </w:t>
       </w:r>
     </w:p>
     <w:p>
@@ -477,199 +453,7 @@
           <w:lang w:eastAsia="es-MX"/>
           <w14:ligatures w14:val="none"/>
         </w:rPr>
-        <w:t xml:space="preserve">Pues como te digo que tenemos las tiendas ven el producto y lo compran ahí en la tienda y se le genera su factura, pero si compra una persona que vive en otra provincia mira el producto escribe al </w:t>
-      </w:r>
-      <w:proofErr w:type="spellStart"/>
-      <w:r>
-        <w:rPr>
-          <w:rFonts w:ascii="Times New Roman" w:eastAsia="Times New Roman" w:hAnsi="Times New Roman" w:cs="Times New Roman"/>
-          <w:kern w:val="0"/>
-          <w:sz w:val="24"/>
-          <w:szCs w:val="24"/>
-          <w:lang w:eastAsia="es-MX"/>
-          <w14:ligatures w14:val="none"/>
-        </w:rPr>
-        <w:t>whatsapp</w:t>
-      </w:r>
-      <w:proofErr w:type="spellEnd"/>
-      <w:r>
-        <w:rPr>
-          <w:rFonts w:ascii="Times New Roman" w:eastAsia="Times New Roman" w:hAnsi="Times New Roman" w:cs="Times New Roman"/>
-          <w:kern w:val="0"/>
-          <w:sz w:val="24"/>
-          <w:szCs w:val="24"/>
-          <w:lang w:eastAsia="es-MX"/>
-          <w14:ligatures w14:val="none"/>
-        </w:rPr>
-        <w:t xml:space="preserve"> se le </w:t>
-      </w:r>
-      <w:proofErr w:type="spellStart"/>
-      <w:r>
-        <w:rPr>
-          <w:rFonts w:ascii="Times New Roman" w:eastAsia="Times New Roman" w:hAnsi="Times New Roman" w:cs="Times New Roman"/>
-          <w:kern w:val="0"/>
-          <w:sz w:val="24"/>
-          <w:szCs w:val="24"/>
-          <w:lang w:eastAsia="es-MX"/>
-          <w14:ligatures w14:val="none"/>
-        </w:rPr>
-        <w:t>envia</w:t>
-      </w:r>
-      <w:proofErr w:type="spellEnd"/>
-      <w:r>
-        <w:rPr>
-          <w:rFonts w:ascii="Times New Roman" w:eastAsia="Times New Roman" w:hAnsi="Times New Roman" w:cs="Times New Roman"/>
-          <w:kern w:val="0"/>
-          <w:sz w:val="24"/>
-          <w:szCs w:val="24"/>
-          <w:lang w:eastAsia="es-MX"/>
-          <w14:ligatures w14:val="none"/>
-        </w:rPr>
-        <w:t xml:space="preserve"> el catalogo para que vea mas opciones y colores, se realiza el pago del producto y se </w:t>
-      </w:r>
-      <w:proofErr w:type="spellStart"/>
-      <w:r>
-        <w:rPr>
-          <w:rFonts w:ascii="Times New Roman" w:eastAsia="Times New Roman" w:hAnsi="Times New Roman" w:cs="Times New Roman"/>
-          <w:kern w:val="0"/>
-          <w:sz w:val="24"/>
-          <w:szCs w:val="24"/>
-          <w:lang w:eastAsia="es-MX"/>
-          <w14:ligatures w14:val="none"/>
-        </w:rPr>
-        <w:t>envia</w:t>
-      </w:r>
-      <w:proofErr w:type="spellEnd"/>
-      <w:r>
-        <w:rPr>
-          <w:rFonts w:ascii="Times New Roman" w:eastAsia="Times New Roman" w:hAnsi="Times New Roman" w:cs="Times New Roman"/>
-          <w:kern w:val="0"/>
-          <w:sz w:val="24"/>
-          <w:szCs w:val="24"/>
-          <w:lang w:eastAsia="es-MX"/>
-          <w14:ligatures w14:val="none"/>
-        </w:rPr>
-        <w:t xml:space="preserve"> el cliente también paga el precio del </w:t>
-      </w:r>
-      <w:proofErr w:type="spellStart"/>
-      <w:r>
-        <w:rPr>
-          <w:rFonts w:ascii="Times New Roman" w:eastAsia="Times New Roman" w:hAnsi="Times New Roman" w:cs="Times New Roman"/>
-          <w:kern w:val="0"/>
-          <w:sz w:val="24"/>
-          <w:szCs w:val="24"/>
-          <w:lang w:eastAsia="es-MX"/>
-          <w14:ligatures w14:val="none"/>
-        </w:rPr>
-        <w:t>envio</w:t>
-      </w:r>
-      <w:proofErr w:type="spellEnd"/>
-      <w:r>
-        <w:rPr>
-          <w:rFonts w:ascii="Times New Roman" w:eastAsia="Times New Roman" w:hAnsi="Times New Roman" w:cs="Times New Roman"/>
-          <w:kern w:val="0"/>
-          <w:sz w:val="24"/>
-          <w:szCs w:val="24"/>
-          <w:lang w:eastAsia="es-MX"/>
-          <w14:ligatures w14:val="none"/>
-        </w:rPr>
-        <w:t xml:space="preserve"> pero al momento de recibir su producto y creo que les saben hacer una proforma </w:t>
-      </w:r>
-      <w:proofErr w:type="spellStart"/>
-      <w:r>
-        <w:rPr>
-          <w:rFonts w:ascii="Times New Roman" w:eastAsia="Times New Roman" w:hAnsi="Times New Roman" w:cs="Times New Roman"/>
-          <w:kern w:val="0"/>
-          <w:sz w:val="24"/>
-          <w:szCs w:val="24"/>
-          <w:lang w:eastAsia="es-MX"/>
-          <w14:ligatures w14:val="none"/>
-        </w:rPr>
-        <w:t>aunq</w:t>
-      </w:r>
-      <w:proofErr w:type="spellEnd"/>
-      <w:r>
-        <w:rPr>
-          <w:rFonts w:ascii="Times New Roman" w:eastAsia="Times New Roman" w:hAnsi="Times New Roman" w:cs="Times New Roman"/>
-          <w:kern w:val="0"/>
-          <w:sz w:val="24"/>
-          <w:szCs w:val="24"/>
-          <w:lang w:eastAsia="es-MX"/>
-          <w14:ligatures w14:val="none"/>
-        </w:rPr>
-        <w:t xml:space="preserve"> no tengo muy bien entendido eso </w:t>
-      </w:r>
-      <w:proofErr w:type="spellStart"/>
-      <w:r>
-        <w:rPr>
-          <w:rFonts w:ascii="Times New Roman" w:eastAsia="Times New Roman" w:hAnsi="Times New Roman" w:cs="Times New Roman"/>
-          <w:kern w:val="0"/>
-          <w:sz w:val="24"/>
-          <w:szCs w:val="24"/>
-          <w:lang w:eastAsia="es-MX"/>
-          <w14:ligatures w14:val="none"/>
-        </w:rPr>
-        <w:t>asi</w:t>
-      </w:r>
-      <w:proofErr w:type="spellEnd"/>
-      <w:r>
-        <w:rPr>
-          <w:rFonts w:ascii="Times New Roman" w:eastAsia="Times New Roman" w:hAnsi="Times New Roman" w:cs="Times New Roman"/>
-          <w:kern w:val="0"/>
-          <w:sz w:val="24"/>
-          <w:szCs w:val="24"/>
-          <w:lang w:eastAsia="es-MX"/>
-          <w14:ligatures w14:val="none"/>
-        </w:rPr>
-        <w:t xml:space="preserve"> q debería de preguntarle a mi </w:t>
-      </w:r>
-      <w:proofErr w:type="spellStart"/>
-      <w:r>
-        <w:rPr>
-          <w:rFonts w:ascii="Times New Roman" w:eastAsia="Times New Roman" w:hAnsi="Times New Roman" w:cs="Times New Roman"/>
-          <w:kern w:val="0"/>
-          <w:sz w:val="24"/>
-          <w:szCs w:val="24"/>
-          <w:lang w:eastAsia="es-MX"/>
-          <w14:ligatures w14:val="none"/>
-        </w:rPr>
-        <w:t>tia</w:t>
-      </w:r>
-      <w:proofErr w:type="spellEnd"/>
-      <w:r>
-        <w:rPr>
-          <w:rFonts w:ascii="Times New Roman" w:eastAsia="Times New Roman" w:hAnsi="Times New Roman" w:cs="Times New Roman"/>
-          <w:kern w:val="0"/>
-          <w:sz w:val="24"/>
-          <w:szCs w:val="24"/>
-          <w:lang w:eastAsia="es-MX"/>
-          <w14:ligatures w14:val="none"/>
-        </w:rPr>
-        <w:t xml:space="preserve"> para estar </w:t>
-      </w:r>
-      <w:proofErr w:type="spellStart"/>
-      <w:r>
-        <w:rPr>
-          <w:rFonts w:ascii="Times New Roman" w:eastAsia="Times New Roman" w:hAnsi="Times New Roman" w:cs="Times New Roman"/>
-          <w:kern w:val="0"/>
-          <w:sz w:val="24"/>
-          <w:szCs w:val="24"/>
-          <w:lang w:eastAsia="es-MX"/>
-          <w14:ligatures w14:val="none"/>
-        </w:rPr>
-        <w:t>mas</w:t>
-      </w:r>
-      <w:proofErr w:type="spellEnd"/>
-      <w:r>
-        <w:rPr>
-          <w:rFonts w:ascii="Times New Roman" w:eastAsia="Times New Roman" w:hAnsi="Times New Roman" w:cs="Times New Roman"/>
-          <w:kern w:val="0"/>
-          <w:sz w:val="24"/>
-          <w:szCs w:val="24"/>
-          <w:lang w:eastAsia="es-MX"/>
-          <w14:ligatures w14:val="none"/>
-        </w:rPr>
-        <w:t xml:space="preserve"> segura</w:t>
+        <w:t>Pues como te digo que tenemos las tiendas ven el producto y lo compran ahí en la tienda y se le genera su factura, pero si compra una persona que vive en otra provincia mira el producto escribe al whatsapp se le envia el catalogo para que vea mas opciones y colores, se realiza el pago del producto y se envia el cliente también paga el precio del envio pero al momento de recibir su producto y creo que les saben hacer una proforma aunq no tengo muy bien entendido eso asi q debería de preguntarle a mi tia para estar mas segura</w:t>
       </w:r>
     </w:p>
     <w:p>
@@ -759,79 +543,7 @@
           <w:lang w:eastAsia="es-MX"/>
           <w14:ligatures w14:val="none"/>
         </w:rPr>
-        <w:t xml:space="preserve">en los estantes al menos </w:t>
-      </w:r>
-      <w:proofErr w:type="spellStart"/>
-      <w:r>
-        <w:rPr>
-          <w:rFonts w:ascii="Times New Roman" w:eastAsia="Times New Roman" w:hAnsi="Times New Roman" w:cs="Times New Roman"/>
-          <w:kern w:val="0"/>
-          <w:sz w:val="24"/>
-          <w:szCs w:val="24"/>
-          <w:lang w:eastAsia="es-MX"/>
-          <w14:ligatures w14:val="none"/>
-        </w:rPr>
-        <w:t>asi</w:t>
-      </w:r>
-      <w:proofErr w:type="spellEnd"/>
-      <w:r>
-        <w:rPr>
-          <w:rFonts w:ascii="Times New Roman" w:eastAsia="Times New Roman" w:hAnsi="Times New Roman" w:cs="Times New Roman"/>
-          <w:kern w:val="0"/>
-          <w:sz w:val="24"/>
-          <w:szCs w:val="24"/>
-          <w:lang w:eastAsia="es-MX"/>
-          <w14:ligatures w14:val="none"/>
-        </w:rPr>
-        <w:t xml:space="preserve"> es cuando pasan por la tienda, pero la mayoría se entera porque tenemos una cuenta de </w:t>
-      </w:r>
-      <w:proofErr w:type="spellStart"/>
-      <w:r>
-        <w:rPr>
-          <w:rFonts w:ascii="Times New Roman" w:eastAsia="Times New Roman" w:hAnsi="Times New Roman" w:cs="Times New Roman"/>
-          <w:kern w:val="0"/>
-          <w:sz w:val="24"/>
-          <w:szCs w:val="24"/>
-          <w:lang w:eastAsia="es-MX"/>
-          <w14:ligatures w14:val="none"/>
-        </w:rPr>
-        <w:t>tik</w:t>
-      </w:r>
-      <w:proofErr w:type="spellEnd"/>
-      <w:r>
-        <w:rPr>
-          <w:rFonts w:ascii="Times New Roman" w:eastAsia="Times New Roman" w:hAnsi="Times New Roman" w:cs="Times New Roman"/>
-          <w:kern w:val="0"/>
-          <w:sz w:val="24"/>
-          <w:szCs w:val="24"/>
-          <w:lang w:eastAsia="es-MX"/>
-          <w14:ligatures w14:val="none"/>
-        </w:rPr>
-        <w:t xml:space="preserve"> </w:t>
-      </w:r>
-      <w:proofErr w:type="spellStart"/>
-      <w:r>
-        <w:rPr>
-          <w:rFonts w:ascii="Times New Roman" w:eastAsia="Times New Roman" w:hAnsi="Times New Roman" w:cs="Times New Roman"/>
-          <w:kern w:val="0"/>
-          <w:sz w:val="24"/>
-          <w:szCs w:val="24"/>
-          <w:lang w:eastAsia="es-MX"/>
-          <w14:ligatures w14:val="none"/>
-        </w:rPr>
-        <w:t>tok</w:t>
-      </w:r>
-      <w:proofErr w:type="spellEnd"/>
-      <w:r>
-        <w:rPr>
-          <w:rFonts w:ascii="Times New Roman" w:eastAsia="Times New Roman" w:hAnsi="Times New Roman" w:cs="Times New Roman"/>
-          <w:kern w:val="0"/>
-          <w:sz w:val="24"/>
-          <w:szCs w:val="24"/>
-          <w:lang w:eastAsia="es-MX"/>
-          <w14:ligatures w14:val="none"/>
-        </w:rPr>
-        <w:t xml:space="preserve"> </w:t>
+        <w:t xml:space="preserve">en los estantes al menos asi es cuando pasan por la tienda, pero la mayoría se entera porque tenemos una cuenta de tik tok </w:t>
       </w:r>
       <w:r>
         <w:rPr>
@@ -843,55 +555,7 @@
           <w14:ligatures w14:val="none"/>
         </w:rPr>
         <w:lastRenderedPageBreak/>
-        <w:t xml:space="preserve">donde se realizan los </w:t>
-      </w:r>
-      <w:proofErr w:type="spellStart"/>
-      <w:r>
-        <w:rPr>
-          <w:rFonts w:ascii="Times New Roman" w:eastAsia="Times New Roman" w:hAnsi="Times New Roman" w:cs="Times New Roman"/>
-          <w:kern w:val="0"/>
-          <w:sz w:val="24"/>
-          <w:szCs w:val="24"/>
-          <w:lang w:eastAsia="es-MX"/>
-          <w14:ligatures w14:val="none"/>
-        </w:rPr>
-        <w:t>lives</w:t>
-      </w:r>
-      <w:proofErr w:type="spellEnd"/>
-      <w:r>
-        <w:rPr>
-          <w:rFonts w:ascii="Times New Roman" w:eastAsia="Times New Roman" w:hAnsi="Times New Roman" w:cs="Times New Roman"/>
-          <w:kern w:val="0"/>
-          <w:sz w:val="24"/>
-          <w:szCs w:val="24"/>
-          <w:lang w:eastAsia="es-MX"/>
-          <w14:ligatures w14:val="none"/>
-        </w:rPr>
-        <w:t xml:space="preserve"> y ahí mencionan la ubicación y las personas van o si son de otro lado solo se les menciona que hacemos </w:t>
-      </w:r>
-      <w:proofErr w:type="spellStart"/>
-      <w:r>
-        <w:rPr>
-          <w:rFonts w:ascii="Times New Roman" w:eastAsia="Times New Roman" w:hAnsi="Times New Roman" w:cs="Times New Roman"/>
-          <w:kern w:val="0"/>
-          <w:sz w:val="24"/>
-          <w:szCs w:val="24"/>
-          <w:lang w:eastAsia="es-MX"/>
-          <w14:ligatures w14:val="none"/>
-        </w:rPr>
-        <w:t>envios</w:t>
-      </w:r>
-      <w:proofErr w:type="spellEnd"/>
-      <w:r>
-        <w:rPr>
-          <w:rFonts w:ascii="Times New Roman" w:eastAsia="Times New Roman" w:hAnsi="Times New Roman" w:cs="Times New Roman"/>
-          <w:kern w:val="0"/>
-          <w:sz w:val="24"/>
-          <w:szCs w:val="24"/>
-          <w:lang w:eastAsia="es-MX"/>
-          <w14:ligatures w14:val="none"/>
-        </w:rPr>
-        <w:t xml:space="preserve"> a todo el país y se manda el catalogo</w:t>
+        <w:t>donde se realizan los lives y ahí mencionan la ubicación y las personas van o si son de otro lado solo se les menciona que hacemos envios a todo el país y se manda el catalogo</w:t>
       </w:r>
     </w:p>
     <w:p>
@@ -944,103 +608,7 @@
           <w:lang w:eastAsia="es-MX"/>
           <w14:ligatures w14:val="none"/>
         </w:rPr>
-        <w:t xml:space="preserve">La importadora por ahora maneja 3 precios, el precio por bulto, por mayorista y por unidad, de esta manera a la persona que quiera llevarse 100 unidades se le menciona el precio del bulto y la cantidad que hay en el bulto, el precio de mayorista es para las personas que se lleven mas de 6 unidades, y pues el precio de unidad para los que solo quieren uno. </w:t>
-      </w:r>
-      <w:proofErr w:type="spellStart"/>
-      <w:r>
-        <w:rPr>
-          <w:rFonts w:ascii="Times New Roman" w:eastAsia="Times New Roman" w:hAnsi="Times New Roman" w:cs="Times New Roman"/>
-          <w:kern w:val="0"/>
-          <w:sz w:val="24"/>
-          <w:szCs w:val="24"/>
-          <w:lang w:eastAsia="es-MX"/>
-          <w14:ligatures w14:val="none"/>
-        </w:rPr>
-        <w:t>Aunq</w:t>
-      </w:r>
-      <w:proofErr w:type="spellEnd"/>
-      <w:r>
-        <w:rPr>
-          <w:rFonts w:ascii="Times New Roman" w:eastAsia="Times New Roman" w:hAnsi="Times New Roman" w:cs="Times New Roman"/>
-          <w:kern w:val="0"/>
-          <w:sz w:val="24"/>
-          <w:szCs w:val="24"/>
-          <w:lang w:eastAsia="es-MX"/>
-          <w14:ligatures w14:val="none"/>
-        </w:rPr>
-        <w:t xml:space="preserve"> había escuchado que probablemente el precio por mayorista ya no va a </w:t>
-      </w:r>
-      <w:proofErr w:type="gramStart"/>
-      <w:r>
-        <w:rPr>
-          <w:rFonts w:ascii="Times New Roman" w:eastAsia="Times New Roman" w:hAnsi="Times New Roman" w:cs="Times New Roman"/>
-          <w:kern w:val="0"/>
-          <w:sz w:val="24"/>
-          <w:szCs w:val="24"/>
-          <w:lang w:eastAsia="es-MX"/>
-          <w14:ligatures w14:val="none"/>
-        </w:rPr>
-        <w:t>ir</w:t>
-      </w:r>
-      <w:proofErr w:type="gramEnd"/>
-      <w:r>
-        <w:rPr>
-          <w:rFonts w:ascii="Times New Roman" w:eastAsia="Times New Roman" w:hAnsi="Times New Roman" w:cs="Times New Roman"/>
-          <w:kern w:val="0"/>
-          <w:sz w:val="24"/>
-          <w:szCs w:val="24"/>
-          <w:lang w:eastAsia="es-MX"/>
-          <w14:ligatures w14:val="none"/>
-        </w:rPr>
-        <w:t xml:space="preserve"> pero igual déjame le pregunto a mi </w:t>
-      </w:r>
-      <w:proofErr w:type="spellStart"/>
-      <w:r>
-        <w:rPr>
-          <w:rFonts w:ascii="Times New Roman" w:eastAsia="Times New Roman" w:hAnsi="Times New Roman" w:cs="Times New Roman"/>
-          <w:kern w:val="0"/>
-          <w:sz w:val="24"/>
-          <w:szCs w:val="24"/>
-          <w:lang w:eastAsia="es-MX"/>
-          <w14:ligatures w14:val="none"/>
-        </w:rPr>
-        <w:t>tia</w:t>
-      </w:r>
-      <w:proofErr w:type="spellEnd"/>
-      <w:r>
-        <w:rPr>
-          <w:rFonts w:ascii="Times New Roman" w:eastAsia="Times New Roman" w:hAnsi="Times New Roman" w:cs="Times New Roman"/>
-          <w:kern w:val="0"/>
-          <w:sz w:val="24"/>
-          <w:szCs w:val="24"/>
-          <w:lang w:eastAsia="es-MX"/>
-          <w14:ligatures w14:val="none"/>
-        </w:rPr>
-        <w:t xml:space="preserve"> para estar </w:t>
-      </w:r>
-      <w:proofErr w:type="spellStart"/>
-      <w:r>
-        <w:rPr>
-          <w:rFonts w:ascii="Times New Roman" w:eastAsia="Times New Roman" w:hAnsi="Times New Roman" w:cs="Times New Roman"/>
-          <w:kern w:val="0"/>
-          <w:sz w:val="24"/>
-          <w:szCs w:val="24"/>
-          <w:lang w:eastAsia="es-MX"/>
-          <w14:ligatures w14:val="none"/>
-        </w:rPr>
-        <w:t>mas</w:t>
-      </w:r>
-      <w:proofErr w:type="spellEnd"/>
-      <w:r>
-        <w:rPr>
-          <w:rFonts w:ascii="Times New Roman" w:eastAsia="Times New Roman" w:hAnsi="Times New Roman" w:cs="Times New Roman"/>
-          <w:kern w:val="0"/>
-          <w:sz w:val="24"/>
-          <w:szCs w:val="24"/>
-          <w:lang w:eastAsia="es-MX"/>
-          <w14:ligatures w14:val="none"/>
-        </w:rPr>
-        <w:t xml:space="preserve"> segura </w:t>
+        <w:t xml:space="preserve">La importadora por ahora maneja 3 precios, el precio por bulto, por mayorista y por unidad, de esta manera a la persona que quiera llevarse 100 unidades se le menciona el precio del bulto y la cantidad que hay en el bulto, el precio de mayorista es para las personas que se lleven mas de 6 unidades, y pues el precio de unidad para los que solo quieren uno. Aunq había escuchado que probablemente el precio por mayorista ya no va a ir pero igual déjame le pregunto a mi tia para estar mas segura </w:t>
       </w:r>
     </w:p>
     <w:p>
@@ -2235,55 +1803,7 @@
           <w:lang w:eastAsia="es-MX"/>
           <w14:ligatures w14:val="none"/>
         </w:rPr>
-        <w:t xml:space="preserve">Si tienen códigos, y si son importantes porque mi </w:t>
-      </w:r>
-      <w:proofErr w:type="spellStart"/>
-      <w:r>
-        <w:rPr>
-          <w:rFonts w:ascii="Times New Roman" w:eastAsia="Times New Roman" w:hAnsi="Times New Roman" w:cs="Times New Roman"/>
-          <w:kern w:val="0"/>
-          <w:sz w:val="24"/>
-          <w:szCs w:val="24"/>
-          <w:lang w:eastAsia="es-MX"/>
-          <w14:ligatures w14:val="none"/>
-        </w:rPr>
-        <w:t>tia</w:t>
-      </w:r>
-      <w:proofErr w:type="spellEnd"/>
-      <w:r>
-        <w:rPr>
-          <w:rFonts w:ascii="Times New Roman" w:eastAsia="Times New Roman" w:hAnsi="Times New Roman" w:cs="Times New Roman"/>
-          <w:kern w:val="0"/>
-          <w:sz w:val="24"/>
-          <w:szCs w:val="24"/>
-          <w:lang w:eastAsia="es-MX"/>
-          <w14:ligatures w14:val="none"/>
-        </w:rPr>
-        <w:t xml:space="preserve"> </w:t>
-      </w:r>
-      <w:proofErr w:type="spellStart"/>
-      <w:r>
-        <w:rPr>
-          <w:rFonts w:ascii="Times New Roman" w:eastAsia="Times New Roman" w:hAnsi="Times New Roman" w:cs="Times New Roman"/>
-          <w:kern w:val="0"/>
-          <w:sz w:val="24"/>
-          <w:szCs w:val="24"/>
-          <w:lang w:eastAsia="es-MX"/>
-          <w14:ligatures w14:val="none"/>
-        </w:rPr>
-        <w:t>asi</w:t>
-      </w:r>
-      <w:proofErr w:type="spellEnd"/>
-      <w:r>
-        <w:rPr>
-          <w:rFonts w:ascii="Times New Roman" w:eastAsia="Times New Roman" w:hAnsi="Times New Roman" w:cs="Times New Roman"/>
-          <w:kern w:val="0"/>
-          <w:sz w:val="24"/>
-          <w:szCs w:val="24"/>
-          <w:lang w:eastAsia="es-MX"/>
-          <w14:ligatures w14:val="none"/>
-        </w:rPr>
-        <w:t xml:space="preserve"> se da cuenta cuanto venden por el sistema que tienen y ver si le robaron o no</w:t>
+        <w:t>Si tienen códigos, y si son importantes porque mi tia asi se da cuenta cuanto venden por el sistema que tienen y ver si le robaron o no</w:t>
       </w:r>
     </w:p>
     <w:p>
@@ -2542,81 +2062,8 @@
           <w:lang w:eastAsia="es-MX"/>
           <w14:ligatures w14:val="none"/>
         </w:rPr>
-        <w:t xml:space="preserve">Las personas que quieren ir al local obviamente compran ahí y </w:t>
-      </w:r>
-      <w:proofErr w:type="gramStart"/>
-      <w:r>
-        <w:rPr>
-          <w:rFonts w:ascii="Times New Roman" w:eastAsia="Times New Roman" w:hAnsi="Times New Roman" w:cs="Times New Roman"/>
-          <w:kern w:val="0"/>
-          <w:sz w:val="24"/>
-          <w:szCs w:val="24"/>
-          <w:lang w:eastAsia="es-MX"/>
-          <w14:ligatures w14:val="none"/>
-        </w:rPr>
-        <w:t>ya</w:t>
-      </w:r>
-      <w:proofErr w:type="gramEnd"/>
-      <w:r>
-        <w:rPr>
-          <w:rFonts w:ascii="Times New Roman" w:eastAsia="Times New Roman" w:hAnsi="Times New Roman" w:cs="Times New Roman"/>
-          <w:kern w:val="0"/>
-          <w:sz w:val="24"/>
-          <w:szCs w:val="24"/>
-          <w:lang w:eastAsia="es-MX"/>
-          <w14:ligatures w14:val="none"/>
-        </w:rPr>
-        <w:t xml:space="preserve"> pero los que viven en otras provincias si hacen </w:t>
-      </w:r>
-      <w:proofErr w:type="spellStart"/>
-      <w:r>
-        <w:rPr>
-          <w:rFonts w:ascii="Times New Roman" w:eastAsia="Times New Roman" w:hAnsi="Times New Roman" w:cs="Times New Roman"/>
-          <w:kern w:val="0"/>
-          <w:sz w:val="24"/>
-          <w:szCs w:val="24"/>
-          <w:lang w:eastAsia="es-MX"/>
-          <w14:ligatures w14:val="none"/>
-        </w:rPr>
-        <w:t>envios</w:t>
-      </w:r>
-      <w:proofErr w:type="spellEnd"/>
-      <w:r>
-        <w:rPr>
-          <w:rFonts w:ascii="Times New Roman" w:eastAsia="Times New Roman" w:hAnsi="Times New Roman" w:cs="Times New Roman"/>
-          <w:kern w:val="0"/>
-          <w:sz w:val="24"/>
-          <w:szCs w:val="24"/>
-          <w:lang w:eastAsia="es-MX"/>
-          <w14:ligatures w14:val="none"/>
-        </w:rPr>
-        <w:t xml:space="preserve"> a todo el país por transporte pesado (que es la </w:t>
-      </w:r>
-      <w:proofErr w:type="spellStart"/>
-      <w:r>
-        <w:rPr>
-          <w:rFonts w:ascii="Times New Roman" w:eastAsia="Times New Roman" w:hAnsi="Times New Roman" w:cs="Times New Roman"/>
-          <w:kern w:val="0"/>
-          <w:sz w:val="24"/>
-          <w:szCs w:val="24"/>
-          <w:lang w:eastAsia="es-MX"/>
-          <w14:ligatures w14:val="none"/>
-        </w:rPr>
-        <w:t>mas</w:t>
-      </w:r>
-      <w:proofErr w:type="spellEnd"/>
-      <w:r>
-        <w:rPr>
-          <w:rFonts w:ascii="Times New Roman" w:eastAsia="Times New Roman" w:hAnsi="Times New Roman" w:cs="Times New Roman"/>
-          <w:kern w:val="0"/>
-          <w:sz w:val="24"/>
-          <w:szCs w:val="24"/>
-          <w:lang w:eastAsia="es-MX"/>
-          <w14:ligatures w14:val="none"/>
-        </w:rPr>
-        <w:t xml:space="preserve"> barato </w:t>
-      </w:r>
-      <w:proofErr w:type="spellStart"/>
+        <w:t xml:space="preserve">Las personas que quieren ir al local obviamente compran ahí y ya pero los que viven en otras provincias si hacen envios a todo el país por transporte pesado (que es la mas barato </w:t>
+      </w:r>
       <w:r>
         <w:rPr>
           <w:rFonts w:ascii="Times New Roman" w:eastAsia="Times New Roman" w:hAnsi="Times New Roman" w:cs="Times New Roman"/>
@@ -2627,43 +2074,7 @@
           <w14:ligatures w14:val="none"/>
         </w:rPr>
         <w:lastRenderedPageBreak/>
-        <w:t>aunq</w:t>
-      </w:r>
-      <w:proofErr w:type="spellEnd"/>
-      <w:r>
-        <w:rPr>
-          <w:rFonts w:ascii="Times New Roman" w:eastAsia="Times New Roman" w:hAnsi="Times New Roman" w:cs="Times New Roman"/>
-          <w:kern w:val="0"/>
-          <w:sz w:val="24"/>
-          <w:szCs w:val="24"/>
-          <w:lang w:eastAsia="es-MX"/>
-          <w14:ligatures w14:val="none"/>
-        </w:rPr>
-        <w:t xml:space="preserve"> también depende la zona), Servientrega y por cooperativa por transporte pesado el cliente paga el </w:t>
-      </w:r>
-      <w:proofErr w:type="spellStart"/>
-      <w:r>
-        <w:rPr>
-          <w:rFonts w:ascii="Times New Roman" w:eastAsia="Times New Roman" w:hAnsi="Times New Roman" w:cs="Times New Roman"/>
-          <w:kern w:val="0"/>
-          <w:sz w:val="24"/>
-          <w:szCs w:val="24"/>
-          <w:lang w:eastAsia="es-MX"/>
-          <w14:ligatures w14:val="none"/>
-        </w:rPr>
-        <w:t>envio</w:t>
-      </w:r>
-      <w:proofErr w:type="spellEnd"/>
-      <w:r>
-        <w:rPr>
-          <w:rFonts w:ascii="Times New Roman" w:eastAsia="Times New Roman" w:hAnsi="Times New Roman" w:cs="Times New Roman"/>
-          <w:kern w:val="0"/>
-          <w:sz w:val="24"/>
-          <w:szCs w:val="24"/>
-          <w:lang w:eastAsia="es-MX"/>
-          <w14:ligatures w14:val="none"/>
-        </w:rPr>
-        <w:t xml:space="preserve"> una vez se le haya entregado el producto </w:t>
+        <w:t xml:space="preserve">aunq también depende la zona), Servientrega y por cooperativa por transporte pesado el cliente paga el envio una vez se le haya entregado el producto </w:t>
       </w:r>
     </w:p>
     <w:p>
@@ -4689,7 +4100,6 @@
           <w14:ligatures w14:val="none"/>
         </w:rPr>
       </w:pPr>
-      <w:proofErr w:type="spellStart"/>
       <w:r>
         <w:rPr>
           <w:rFonts w:ascii="Courier New" w:eastAsia="Times New Roman" w:hAnsi="Courier New" w:cs="Courier New"/>
@@ -4701,7 +4111,6 @@
         </w:rPr>
         <w:t>Checkout</w:t>
       </w:r>
-      <w:proofErr w:type="spellEnd"/>
     </w:p>
     <w:p>
       <w:pPr>
@@ -6164,234 +5573,18 @@
           <w14:ligatures w14:val="none"/>
         </w:rPr>
         <w:lastRenderedPageBreak/>
-        <w:t xml:space="preserve">tarjeta que tienen los numero para contactar, también tiene </w:t>
-      </w:r>
-      <w:proofErr w:type="spellStart"/>
-      <w:r>
-        <w:rPr>
-          <w:rFonts w:ascii="Times New Roman" w:eastAsia="Times New Roman" w:hAnsi="Times New Roman" w:cs="Times New Roman"/>
-          <w:kern w:val="0"/>
-          <w:sz w:val="24"/>
-          <w:szCs w:val="24"/>
-          <w:lang w:eastAsia="es-MX"/>
-          <w14:ligatures w14:val="none"/>
-        </w:rPr>
-        <w:t>yn</w:t>
-      </w:r>
-      <w:proofErr w:type="spellEnd"/>
-      <w:r>
-        <w:rPr>
-          <w:rFonts w:ascii="Times New Roman" w:eastAsia="Times New Roman" w:hAnsi="Times New Roman" w:cs="Times New Roman"/>
-          <w:kern w:val="0"/>
-          <w:sz w:val="24"/>
-          <w:szCs w:val="24"/>
-          <w:lang w:eastAsia="es-MX"/>
-          <w14:ligatures w14:val="none"/>
-        </w:rPr>
-        <w:t xml:space="preserve"> poco de lo q venden y la dirección de la sucursal, redes sociales si tienen </w:t>
-      </w:r>
-      <w:proofErr w:type="spellStart"/>
-      <w:r>
-        <w:rPr>
-          <w:rFonts w:ascii="Times New Roman" w:eastAsia="Times New Roman" w:hAnsi="Times New Roman" w:cs="Times New Roman"/>
-          <w:kern w:val="0"/>
-          <w:sz w:val="24"/>
-          <w:szCs w:val="24"/>
-          <w:lang w:eastAsia="es-MX"/>
-          <w14:ligatures w14:val="none"/>
-        </w:rPr>
-        <w:t>aunq</w:t>
-      </w:r>
-      <w:proofErr w:type="spellEnd"/>
-      <w:r>
-        <w:rPr>
-          <w:rFonts w:ascii="Times New Roman" w:eastAsia="Times New Roman" w:hAnsi="Times New Roman" w:cs="Times New Roman"/>
-          <w:kern w:val="0"/>
-          <w:sz w:val="24"/>
-          <w:szCs w:val="24"/>
-          <w:lang w:eastAsia="es-MX"/>
-          <w14:ligatures w14:val="none"/>
-        </w:rPr>
-        <w:t xml:space="preserve"> mayormente están </w:t>
-      </w:r>
-      <w:proofErr w:type="spellStart"/>
-      <w:r>
-        <w:rPr>
-          <w:rFonts w:ascii="Times New Roman" w:eastAsia="Times New Roman" w:hAnsi="Times New Roman" w:cs="Times New Roman"/>
-          <w:kern w:val="0"/>
-          <w:sz w:val="24"/>
-          <w:szCs w:val="24"/>
-          <w:lang w:eastAsia="es-MX"/>
-          <w14:ligatures w14:val="none"/>
-        </w:rPr>
-        <w:t>mas</w:t>
-      </w:r>
-      <w:proofErr w:type="spellEnd"/>
-      <w:r>
-        <w:rPr>
-          <w:rFonts w:ascii="Times New Roman" w:eastAsia="Times New Roman" w:hAnsi="Times New Roman" w:cs="Times New Roman"/>
-          <w:kern w:val="0"/>
-          <w:sz w:val="24"/>
-          <w:szCs w:val="24"/>
-          <w:lang w:eastAsia="es-MX"/>
-          <w14:ligatures w14:val="none"/>
-        </w:rPr>
-        <w:t xml:space="preserve"> activos en </w:t>
-      </w:r>
-      <w:proofErr w:type="spellStart"/>
-      <w:r>
-        <w:rPr>
-          <w:rFonts w:ascii="Times New Roman" w:eastAsia="Times New Roman" w:hAnsi="Times New Roman" w:cs="Times New Roman"/>
-          <w:kern w:val="0"/>
-          <w:sz w:val="24"/>
-          <w:szCs w:val="24"/>
-          <w:lang w:eastAsia="es-MX"/>
-          <w14:ligatures w14:val="none"/>
-        </w:rPr>
-        <w:t>tik</w:t>
-      </w:r>
-      <w:proofErr w:type="spellEnd"/>
-      <w:r>
-        <w:rPr>
-          <w:rFonts w:ascii="Times New Roman" w:eastAsia="Times New Roman" w:hAnsi="Times New Roman" w:cs="Times New Roman"/>
-          <w:kern w:val="0"/>
-          <w:sz w:val="24"/>
-          <w:szCs w:val="24"/>
-          <w:lang w:eastAsia="es-MX"/>
-          <w14:ligatures w14:val="none"/>
-        </w:rPr>
-        <w:t xml:space="preserve"> </w:t>
-      </w:r>
-      <w:proofErr w:type="spellStart"/>
-      <w:r>
-        <w:rPr>
-          <w:rFonts w:ascii="Times New Roman" w:eastAsia="Times New Roman" w:hAnsi="Times New Roman" w:cs="Times New Roman"/>
-          <w:kern w:val="0"/>
-          <w:sz w:val="24"/>
-          <w:szCs w:val="24"/>
-          <w:lang w:eastAsia="es-MX"/>
-          <w14:ligatures w14:val="none"/>
-        </w:rPr>
-        <w:t>tok</w:t>
-      </w:r>
-      <w:proofErr w:type="spellEnd"/>
-      <w:r>
-        <w:rPr>
-          <w:rFonts w:ascii="Times New Roman" w:eastAsia="Times New Roman" w:hAnsi="Times New Roman" w:cs="Times New Roman"/>
-          <w:kern w:val="0"/>
-          <w:sz w:val="24"/>
-          <w:szCs w:val="24"/>
-          <w:lang w:eastAsia="es-MX"/>
-          <w14:ligatures w14:val="none"/>
-        </w:rPr>
-        <w:t xml:space="preserve"> donde hacen videos y </w:t>
-      </w:r>
-      <w:proofErr w:type="spellStart"/>
-      <w:r>
-        <w:rPr>
-          <w:rFonts w:ascii="Times New Roman" w:eastAsia="Times New Roman" w:hAnsi="Times New Roman" w:cs="Times New Roman"/>
-          <w:kern w:val="0"/>
-          <w:sz w:val="24"/>
-          <w:szCs w:val="24"/>
-          <w:lang w:eastAsia="es-MX"/>
-          <w14:ligatures w14:val="none"/>
-        </w:rPr>
-        <w:t>lives</w:t>
-      </w:r>
-      <w:proofErr w:type="spellEnd"/>
-      <w:r>
-        <w:rPr>
-          <w:rFonts w:ascii="Times New Roman" w:eastAsia="Times New Roman" w:hAnsi="Times New Roman" w:cs="Times New Roman"/>
-          <w:kern w:val="0"/>
-          <w:sz w:val="24"/>
-          <w:szCs w:val="24"/>
-          <w:lang w:eastAsia="es-MX"/>
-          <w14:ligatures w14:val="none"/>
-        </w:rPr>
-        <w:t xml:space="preserve"> para promocionar y poder vender realizando combos, promociones</w:t>
-      </w:r>
-      <w:r>
-        <w:rPr>
-          <w:rFonts w:ascii="Times New Roman" w:eastAsia="Times New Roman" w:hAnsi="Times New Roman" w:cs="Times New Roman"/>
-          <w:kern w:val="0"/>
-          <w:sz w:val="24"/>
-          <w:szCs w:val="24"/>
-          <w:lang w:eastAsia="es-MX"/>
-          <w14:ligatures w14:val="none"/>
-        </w:rPr>
-        <w:t xml:space="preserve">, algunos de los clientes compran por el </w:t>
-      </w:r>
-      <w:proofErr w:type="spellStart"/>
-      <w:r>
-        <w:rPr>
-          <w:rFonts w:ascii="Times New Roman" w:eastAsia="Times New Roman" w:hAnsi="Times New Roman" w:cs="Times New Roman"/>
-          <w:kern w:val="0"/>
-          <w:sz w:val="24"/>
-          <w:szCs w:val="24"/>
-          <w:lang w:eastAsia="es-MX"/>
-          <w14:ligatures w14:val="none"/>
-        </w:rPr>
-        <w:t>live</w:t>
-      </w:r>
-      <w:proofErr w:type="spellEnd"/>
-      <w:r>
-        <w:rPr>
-          <w:rFonts w:ascii="Times New Roman" w:eastAsia="Times New Roman" w:hAnsi="Times New Roman" w:cs="Times New Roman"/>
-          <w:kern w:val="0"/>
-          <w:sz w:val="24"/>
-          <w:szCs w:val="24"/>
-          <w:lang w:eastAsia="es-MX"/>
-          <w14:ligatures w14:val="none"/>
-        </w:rPr>
-        <w:t xml:space="preserve"> ya que preguntan bastante. No tienen fotografías profesionales la mayoría de fotos que se suben a la pagina de la sucursal de Riobamba (Solo son fotos tomadas desde el celu, te dejo foto de </w:t>
-      </w:r>
-      <w:proofErr w:type="spellStart"/>
-      <w:r>
-        <w:rPr>
-          <w:rFonts w:ascii="Times New Roman" w:eastAsia="Times New Roman" w:hAnsi="Times New Roman" w:cs="Times New Roman"/>
-          <w:kern w:val="0"/>
-          <w:sz w:val="24"/>
-          <w:szCs w:val="24"/>
-          <w:lang w:eastAsia="es-MX"/>
-          <w14:ligatures w14:val="none"/>
-        </w:rPr>
-        <w:t>como</w:t>
-      </w:r>
-      <w:proofErr w:type="spellEnd"/>
-      <w:r>
-        <w:rPr>
-          <w:rFonts w:ascii="Times New Roman" w:eastAsia="Times New Roman" w:hAnsi="Times New Roman" w:cs="Times New Roman"/>
-          <w:kern w:val="0"/>
-          <w:sz w:val="24"/>
-          <w:szCs w:val="24"/>
-          <w:lang w:eastAsia="es-MX"/>
-          <w14:ligatures w14:val="none"/>
-        </w:rPr>
-        <w:t xml:space="preserve"> es, hasta hay productos que no cargan las imágenes y estaba revisando que </w:t>
-      </w:r>
-      <w:proofErr w:type="spellStart"/>
-      <w:r>
-        <w:rPr>
-          <w:rFonts w:ascii="Times New Roman" w:eastAsia="Times New Roman" w:hAnsi="Times New Roman" w:cs="Times New Roman"/>
-          <w:kern w:val="0"/>
-          <w:sz w:val="24"/>
-          <w:szCs w:val="24"/>
-          <w:lang w:eastAsia="es-MX"/>
-          <w14:ligatures w14:val="none"/>
-        </w:rPr>
-        <w:t>tenia</w:t>
-      </w:r>
-      <w:proofErr w:type="spellEnd"/>
-      <w:r>
-        <w:rPr>
-          <w:rFonts w:ascii="Times New Roman" w:eastAsia="Times New Roman" w:hAnsi="Times New Roman" w:cs="Times New Roman"/>
-          <w:kern w:val="0"/>
-          <w:sz w:val="24"/>
-          <w:szCs w:val="24"/>
-          <w:lang w:eastAsia="es-MX"/>
-          <w14:ligatures w14:val="none"/>
-        </w:rPr>
-        <w:t xml:space="preserve"> algunos errores)</w:t>
+        <w:t>tarjeta que tienen los numero para contactar, también tiene yn poco de lo q venden y la dirección de la sucursal, redes sociales si tienen aunq mayormente están mas activos en tik tok donde hacen videos y lives para promocionar y poder vender realizando combos, promociones</w:t>
+      </w:r>
+      <w:r>
+        <w:rPr>
+          <w:rFonts w:ascii="Times New Roman" w:eastAsia="Times New Roman" w:hAnsi="Times New Roman" w:cs="Times New Roman"/>
+          <w:kern w:val="0"/>
+          <w:sz w:val="24"/>
+          <w:szCs w:val="24"/>
+          <w:lang w:eastAsia="es-MX"/>
+          <w14:ligatures w14:val="none"/>
+        </w:rPr>
+        <w:t>, algunos de los clientes compran por el live ya que preguntan bastante. No tienen fotografías profesionales la mayoría de fotos que se suben a la pagina de la sucursal de Riobamba (Solo son fotos tomadas desde el celu, te dejo foto de como es, hasta hay productos que no cargan las imágenes y estaba revisando que tenia algunos errores)</w:t>
       </w:r>
     </w:p>
     <w:p>
@@ -6983,45 +6176,8 @@
           <w:lang w:eastAsia="es-MX"/>
           <w14:ligatures w14:val="none"/>
         </w:rPr>
-        <w:t xml:space="preserve"> — Cafeteras, coladores de acero, ollas de acero, bandejas de acero, tazones de acero, dispensador de aceite, jarras medidoras, </w:t>
-      </w:r>
-      <w:proofErr w:type="spellStart"/>
-      <w:r>
-        <w:rPr>
-          <w:rFonts w:ascii="Times New Roman" w:eastAsia="Times New Roman" w:hAnsi="Times New Roman" w:cs="Times New Roman"/>
-          <w:kern w:val="0"/>
-          <w:sz w:val="24"/>
-          <w:szCs w:val="24"/>
-          <w:lang w:eastAsia="es-MX"/>
-          <w14:ligatures w14:val="none"/>
-        </w:rPr>
-        <w:t>infusoras</w:t>
-      </w:r>
-      <w:proofErr w:type="spellEnd"/>
-      <w:r>
-        <w:rPr>
-          <w:rFonts w:ascii="Times New Roman" w:eastAsia="Times New Roman" w:hAnsi="Times New Roman" w:cs="Times New Roman"/>
-          <w:kern w:val="0"/>
-          <w:sz w:val="24"/>
-          <w:szCs w:val="24"/>
-          <w:lang w:eastAsia="es-MX"/>
-          <w14:ligatures w14:val="none"/>
-        </w:rPr>
-        <w:t>, tablas para picar, porta leche, exprimidor de limones/</w:t>
-      </w:r>
-      <w:proofErr w:type="spellStart"/>
-      <w:r>
-        <w:rPr>
-          <w:rFonts w:ascii="Times New Roman" w:eastAsia="Times New Roman" w:hAnsi="Times New Roman" w:cs="Times New Roman"/>
-          <w:kern w:val="0"/>
-          <w:sz w:val="24"/>
-          <w:szCs w:val="24"/>
-          <w:lang w:eastAsia="es-MX"/>
-          <w14:ligatures w14:val="none"/>
-        </w:rPr>
-        <w:t>portaservilletas</w:t>
-      </w:r>
-      <w:proofErr w:type="spellEnd"/>
+        <w:t xml:space="preserve"> — Cafeteras, coladores de acero, ollas de acero, bandejas de acero, tazones de acero, dispensador de aceite, jarras medidoras, infusoras, tablas para picar, porta leche, exprimidor de limones/portaservilletas</w:t>
+      </w:r>
       <w:r>
         <w:rPr>
           <w:rFonts w:ascii="Times New Roman" w:eastAsia="Times New Roman" w:hAnsi="Times New Roman" w:cs="Times New Roman"/>
@@ -7068,31 +6224,7 @@
           <w:lang w:eastAsia="es-MX"/>
           <w14:ligatures w14:val="none"/>
         </w:rPr>
-        <w:t xml:space="preserve"> — Platos cerámica, </w:t>
-      </w:r>
-      <w:proofErr w:type="spellStart"/>
-      <w:r>
-        <w:rPr>
-          <w:rFonts w:ascii="Times New Roman" w:eastAsia="Times New Roman" w:hAnsi="Times New Roman" w:cs="Times New Roman"/>
-          <w:kern w:val="0"/>
-          <w:sz w:val="24"/>
-          <w:szCs w:val="24"/>
-          <w:lang w:eastAsia="es-MX"/>
-          <w14:ligatures w14:val="none"/>
-        </w:rPr>
-        <w:t>melamine</w:t>
-      </w:r>
-      <w:proofErr w:type="spellEnd"/>
-      <w:r>
-        <w:rPr>
-          <w:rFonts w:ascii="Times New Roman" w:eastAsia="Times New Roman" w:hAnsi="Times New Roman" w:cs="Times New Roman"/>
-          <w:kern w:val="0"/>
-          <w:sz w:val="24"/>
-          <w:szCs w:val="24"/>
-          <w:lang w:eastAsia="es-MX"/>
-          <w14:ligatures w14:val="none"/>
-        </w:rPr>
-        <w:t>, opal, tazas de cerámica, copas, vasos, cristalería, cubiertos</w:t>
+        <w:t xml:space="preserve"> — Platos cerámica, melamine, opal, tazas de cerámica, copas, vasos, cristalería, cubiertos</w:t>
       </w:r>
     </w:p>
     <w:p>
@@ -7129,55 +6261,7 @@
           <w:lang w:eastAsia="es-MX"/>
           <w14:ligatures w14:val="none"/>
         </w:rPr>
-        <w:t xml:space="preserve"> — Floreros de madera, floreros de vidrio, espejos acrílicos, </w:t>
-      </w:r>
-      <w:proofErr w:type="spellStart"/>
-      <w:r>
-        <w:rPr>
-          <w:rFonts w:ascii="Times New Roman" w:eastAsia="Times New Roman" w:hAnsi="Times New Roman" w:cs="Times New Roman"/>
-          <w:kern w:val="0"/>
-          <w:sz w:val="24"/>
-          <w:szCs w:val="24"/>
-          <w:lang w:eastAsia="es-MX"/>
-          <w14:ligatures w14:val="none"/>
-        </w:rPr>
-        <w:t>portaretratos</w:t>
-      </w:r>
-      <w:proofErr w:type="spellEnd"/>
-      <w:r>
-        <w:rPr>
-          <w:rFonts w:ascii="Times New Roman" w:eastAsia="Times New Roman" w:hAnsi="Times New Roman" w:cs="Times New Roman"/>
-          <w:kern w:val="0"/>
-          <w:sz w:val="24"/>
-          <w:szCs w:val="24"/>
-          <w:lang w:eastAsia="es-MX"/>
-          <w14:ligatures w14:val="none"/>
-        </w:rPr>
-        <w:t>, porta retratos de vidrio, piedras decorativas, chimeneas LED, vallas y césped decorativo</w:t>
-      </w:r>
-      <w:proofErr w:type="gramStart"/>
-      <w:r>
-        <w:rPr>
-          <w:rFonts w:ascii="Times New Roman" w:eastAsia="Times New Roman" w:hAnsi="Times New Roman" w:cs="Times New Roman"/>
-          <w:kern w:val="0"/>
-          <w:sz w:val="24"/>
-          <w:szCs w:val="24"/>
-          <w:lang w:eastAsia="es-MX"/>
-          <w14:ligatures w14:val="none"/>
-        </w:rPr>
-        <w:t>, ,</w:t>
-      </w:r>
-      <w:proofErr w:type="gramEnd"/>
-      <w:r>
-        <w:rPr>
-          <w:rFonts w:ascii="Times New Roman" w:eastAsia="Times New Roman" w:hAnsi="Times New Roman" w:cs="Times New Roman"/>
-          <w:kern w:val="0"/>
-          <w:sz w:val="24"/>
-          <w:szCs w:val="24"/>
-          <w:lang w:eastAsia="es-MX"/>
-          <w14:ligatures w14:val="none"/>
-        </w:rPr>
-        <w:t xml:space="preserve"> bailarinas de repostería</w:t>
+        <w:t xml:space="preserve"> — Floreros de madera, floreros de vidrio, espejos acrílicos, portaretratos, porta retratos de vidrio, piedras decorativas, chimeneas LED, vallas y césped decorativo, , bailarinas de repostería</w:t>
       </w:r>
       <w:r>
         <w:rPr>
@@ -7417,31 +6501,7 @@
           <w:lang w:eastAsia="es-MX"/>
           <w14:ligatures w14:val="none"/>
         </w:rPr>
-        <w:t xml:space="preserve"> — Bebés, legos, peluches, cubo </w:t>
-      </w:r>
-      <w:proofErr w:type="spellStart"/>
-      <w:r>
-        <w:rPr>
-          <w:rFonts w:ascii="Times New Roman" w:eastAsia="Times New Roman" w:hAnsi="Times New Roman" w:cs="Times New Roman"/>
-          <w:kern w:val="0"/>
-          <w:sz w:val="24"/>
-          <w:szCs w:val="24"/>
-          <w:lang w:eastAsia="es-MX"/>
-          <w14:ligatures w14:val="none"/>
-        </w:rPr>
-        <w:t>rubik</w:t>
-      </w:r>
-      <w:proofErr w:type="spellEnd"/>
-      <w:r>
-        <w:rPr>
-          <w:rFonts w:ascii="Times New Roman" w:eastAsia="Times New Roman" w:hAnsi="Times New Roman" w:cs="Times New Roman"/>
-          <w:kern w:val="0"/>
-          <w:sz w:val="24"/>
-          <w:szCs w:val="24"/>
-          <w:lang w:eastAsia="es-MX"/>
-          <w14:ligatures w14:val="none"/>
-        </w:rPr>
-        <w:t xml:space="preserve"> (diversión), loncheras, pañaleras</w:t>
+        <w:t xml:space="preserve"> — Bebés, legos, peluches, cubo rubik (diversión), loncheras, pañaleras</w:t>
       </w:r>
       <w:r>
         <w:rPr>
@@ -7624,14 +6684,6 @@
     <w:p>
       <w:pPr>
         <w:spacing w:before="100" w:beforeAutospacing="1" w:after="100" w:afterAutospacing="1" w:line="240" w:lineRule="auto"/>
-        <w:rPr>
-          <w:rFonts w:ascii="Times New Roman" w:eastAsia="Times New Roman" w:hAnsi="Times New Roman" w:cs="Times New Roman"/>
-          <w:kern w:val="0"/>
-          <w:sz w:val="24"/>
-          <w:szCs w:val="24"/>
-          <w:lang w:eastAsia="es-MX"/>
-          <w14:ligatures w14:val="none"/>
-        </w:rPr>
       </w:pPr>
       <w:r>
         <w:rPr>
@@ -7657,6 +6709,22 @@
         </w:rPr>
         <w:t xml:space="preserve"> — Ventiladores, parlantes</w:t>
       </w:r>
+      <w:r>
+        <w:t xml:space="preserve"> </w:t>
+      </w:r>
+    </w:p>
+    <w:p>
+      <w:pPr>
+        <w:spacing w:before="100" w:beforeAutospacing="1" w:after="100" w:afterAutospacing="1" w:line="240" w:lineRule="auto"/>
+        <w:rPr>
+          <w:rFonts w:ascii="Times New Roman" w:eastAsia="Times New Roman" w:hAnsi="Times New Roman" w:cs="Times New Roman"/>
+          <w:kern w:val="0"/>
+          <w:sz w:val="24"/>
+          <w:szCs w:val="24"/>
+          <w:lang w:eastAsia="es-MX"/>
+          <w14:ligatures w14:val="none"/>
+        </w:rPr>
+      </w:pPr>
     </w:p>
     <w:sectPr>
       <w:pgSz w:w="12240" w:h="15840"/>

</xml_diff>